<commit_message>
made the search functionality
</commit_message>
<xml_diff>
--- a/Internet Programming.docx
+++ b/Internet Programming.docx
@@ -33,7 +33,7 @@
                 <w:lang w:eastAsia="en-AU"/>
               </w:rPr>
               <w:drawing>
-                <wp:inline distT="0" distB="0" distL="0" distR="0" wp14:anchorId="52BC7E4F" wp14:editId="7A09F79A">
+                <wp:inline distT="0" distB="0" distL="0" distR="0" wp14:anchorId="52BC7E4F" wp14:editId="3089235B">
                   <wp:extent cx="6857664" cy="6188799"/>
                   <wp:effectExtent l="0" t="0" r="635" b="2540"/>
                   <wp:docPr id="2" name="Picture 2"/>
@@ -185,6 +185,12 @@
             </w:pPr>
             <w:r>
               <w:t>George Mourad             22P0114</w:t>
+            </w:r>
+          </w:p>
+          <w:p/>
+          <w:p>
+            <w:r>
+              <w:t>MARK EDWARD                               22P0181</w:t>
             </w:r>
           </w:p>
           <w:p/>
@@ -1002,6 +1008,58 @@
       </w:r>
     </w:p>
     <w:p/>
+    <w:p>
+      <w:r>
+        <w:t>SPRINT 2:</w:t>
+      </w:r>
+    </w:p>
+    <w:p>
+      <w:r>
+        <w:rPr>
+          <w:noProof/>
+        </w:rPr>
+        <w:drawing>
+          <wp:inline distT="0" distB="0" distL="0" distR="0" wp14:anchorId="6C34D05F" wp14:editId="43F40EB2">
+            <wp:extent cx="6858000" cy="1045210"/>
+            <wp:effectExtent l="0" t="0" r="0" b="2540"/>
+            <wp:docPr id="1992677668" name="Picture 1"/>
+            <wp:cNvGraphicFramePr>
+              <a:graphicFrameLocks xmlns:a="http://schemas.openxmlformats.org/drawingml/2006/main" noChangeAspect="1"/>
+            </wp:cNvGraphicFramePr>
+            <a:graphic xmlns:a="http://schemas.openxmlformats.org/drawingml/2006/main">
+              <a:graphicData uri="http://schemas.openxmlformats.org/drawingml/2006/picture">
+                <pic:pic xmlns:pic="http://schemas.openxmlformats.org/drawingml/2006/picture">
+                  <pic:nvPicPr>
+                    <pic:cNvPr id="1992677668" name=""/>
+                    <pic:cNvPicPr/>
+                  </pic:nvPicPr>
+                  <pic:blipFill>
+                    <a:blip r:embed="rId16"/>
+                    <a:stretch>
+                      <a:fillRect/>
+                    </a:stretch>
+                  </pic:blipFill>
+                  <pic:spPr>
+                    <a:xfrm>
+                      <a:off x="0" y="0"/>
+                      <a:ext cx="6858000" cy="1045210"/>
+                    </a:xfrm>
+                    <a:prstGeom prst="rect">
+                      <a:avLst/>
+                    </a:prstGeom>
+                  </pic:spPr>
+                </pic:pic>
+              </a:graphicData>
+            </a:graphic>
+          </wp:inline>
+        </w:drawing>
+      </w:r>
+    </w:p>
+    <w:p>
+      <w:r>
+        <w:tab/>
+      </w:r>
+    </w:p>
     <w:p/>
     <w:p/>
     <w:p/>
@@ -1051,7 +1109,6 @@
       </w:pPr>
       <w:bookmarkStart w:id="5" w:name="_Toc227723824"/>
       <w:r>
-        <w:lastRenderedPageBreak/>
         <w:t>Database design</w:t>
       </w:r>
       <w:bookmarkEnd w:id="5"/>
@@ -1077,7 +1134,7 @@
                     <pic:cNvPicPr/>
                   </pic:nvPicPr>
                   <pic:blipFill>
-                    <a:blip r:embed="rId16">
+                    <a:blip r:embed="rId17">
                       <a:extLst>
                         <a:ext uri="{28A0092B-C50C-407E-A947-70E740481C1C}">
                           <a14:useLocalDpi xmlns:a14="http://schemas.microsoft.com/office/drawing/2010/main" val="0"/>
@@ -1107,9 +1164,9 @@
     <w:p/>
     <w:p/>
     <w:sectPr>
-      <w:headerReference w:type="even" r:id="rId17"/>
-      <w:headerReference w:type="default" r:id="rId18"/>
-      <w:footerReference w:type="default" r:id="rId19"/>
+      <w:headerReference w:type="even" r:id="rId18"/>
+      <w:headerReference w:type="default" r:id="rId19"/>
+      <w:footerReference w:type="default" r:id="rId20"/>
       <w:pgSz w:w="12240" w:h="15840" w:code="1"/>
       <w:pgMar w:top="720" w:right="720" w:bottom="720" w:left="720" w:header="289" w:footer="0" w:gutter="0"/>
       <w:cols w:space="708"/>
@@ -5133,6 +5190,30 @@
 </file>
 
 <file path=customXml/item1.xml><?xml version="1.0" encoding="utf-8"?>
+<b:Sources xmlns:b="http://schemas.openxmlformats.org/officeDocument/2006/bibliography" xmlns="http://schemas.openxmlformats.org/officeDocument/2006/bibliography" SelectedStyle="\APASixthEditionOfficeOnline.xsl" StyleName="APA" Version="6"/>
+</file>
+
+<file path=customXml/item2.xml><?xml version="1.0" encoding="utf-8"?>
+<p:properties xmlns:p="http://schemas.microsoft.com/office/2006/metadata/properties" xmlns:xsi="http://www.w3.org/2001/XMLSchema-instance" xmlns:pc="http://schemas.microsoft.com/office/infopath/2007/PartnerControls">
+  <documentManagement>
+    <Status xmlns="71af3243-3dd4-4a8d-8c0d-dd76da1f02a5">Not started</Status>
+    <MediaServiceKeyPoints xmlns="71af3243-3dd4-4a8d-8c0d-dd76da1f02a5" xsi:nil="true"/>
+    <_ip_UnifiedCompliancePolicyUIAction xmlns="http://schemas.microsoft.com/sharepoint/v3" xsi:nil="true"/>
+    <Image xmlns="71af3243-3dd4-4a8d-8c0d-dd76da1f02a5">
+      <Url xsi:nil="true"/>
+      <Description xsi:nil="true"/>
+    </Image>
+    <Background xmlns="71af3243-3dd4-4a8d-8c0d-dd76da1f02a5">false</Background>
+    <_ip_UnifiedCompliancePolicyProperties xmlns="http://schemas.microsoft.com/sharepoint/v3" xsi:nil="true"/>
+    <ImageTagsTaxHTField xmlns="71af3243-3dd4-4a8d-8c0d-dd76da1f02a5">
+      <Terms xmlns="http://schemas.microsoft.com/office/infopath/2007/PartnerControls"/>
+    </ImageTagsTaxHTField>
+    <TaxCatchAll xmlns="230e9df3-be65-4c73-a93b-d1236ebd677e" xsi:nil="true"/>
+  </documentManagement>
+</p:properties>
+</file>
+
+<file path=customXml/item3.xml><?xml version="1.0" encoding="utf-8"?>
 <ct:contentTypeSchema xmlns:ct="http://schemas.microsoft.com/office/2006/metadata/contentType" xmlns:ma="http://schemas.microsoft.com/office/2006/metadata/properties/metaAttributes" ct:_="" ma:_="" ma:contentTypeName="Document" ma:contentTypeID="0x01010079F111ED35F8CC479449609E8A0923A6" ma:contentTypeVersion="30" ma:contentTypeDescription="Create a new document." ma:contentTypeScope="" ma:versionID="cec0622158e8f13124e9e8fd4de31bd1">
   <xsd:schema xmlns:xsd="http://www.w3.org/2001/XMLSchema" xmlns:xs="http://www.w3.org/2001/XMLSchema" xmlns:p="http://schemas.microsoft.com/office/2006/metadata/properties" xmlns:ns1="http://schemas.microsoft.com/sharepoint/v3" xmlns:ns2="71af3243-3dd4-4a8d-8c0d-dd76da1f02a5" xmlns:ns3="16c05727-aa75-4e4a-9b5f-8a80a1165891" xmlns:ns4="230e9df3-be65-4c73-a93b-d1236ebd677e" targetNamespace="http://schemas.microsoft.com/office/2006/metadata/properties" ma:root="true" ma:fieldsID="3b52f30ab005d15df08657af532e6e38" ns1:_="" ns2:_="" ns3:_="" ns4:_="">
     <xsd:import namespace="http://schemas.microsoft.com/sharepoint/v3"/>
@@ -5450,30 +5531,6 @@
 </ct:contentTypeSchema>
 </file>
 
-<file path=customXml/item2.xml><?xml version="1.0" encoding="utf-8"?>
-<p:properties xmlns:p="http://schemas.microsoft.com/office/2006/metadata/properties" xmlns:xsi="http://www.w3.org/2001/XMLSchema-instance" xmlns:pc="http://schemas.microsoft.com/office/infopath/2007/PartnerControls">
-  <documentManagement>
-    <Status xmlns="71af3243-3dd4-4a8d-8c0d-dd76da1f02a5">Not started</Status>
-    <MediaServiceKeyPoints xmlns="71af3243-3dd4-4a8d-8c0d-dd76da1f02a5" xsi:nil="true"/>
-    <_ip_UnifiedCompliancePolicyUIAction xmlns="http://schemas.microsoft.com/sharepoint/v3" xsi:nil="true"/>
-    <Image xmlns="71af3243-3dd4-4a8d-8c0d-dd76da1f02a5">
-      <Url xsi:nil="true"/>
-      <Description xsi:nil="true"/>
-    </Image>
-    <Background xmlns="71af3243-3dd4-4a8d-8c0d-dd76da1f02a5">false</Background>
-    <_ip_UnifiedCompliancePolicyProperties xmlns="http://schemas.microsoft.com/sharepoint/v3" xsi:nil="true"/>
-    <ImageTagsTaxHTField xmlns="71af3243-3dd4-4a8d-8c0d-dd76da1f02a5">
-      <Terms xmlns="http://schemas.microsoft.com/office/infopath/2007/PartnerControls"/>
-    </ImageTagsTaxHTField>
-    <TaxCatchAll xmlns="230e9df3-be65-4c73-a93b-d1236ebd677e" xsi:nil="true"/>
-  </documentManagement>
-</p:properties>
-</file>
-
-<file path=customXml/item3.xml><?xml version="1.0" encoding="utf-8"?>
-<b:Sources xmlns:b="http://schemas.openxmlformats.org/officeDocument/2006/bibliography" xmlns="http://schemas.openxmlformats.org/officeDocument/2006/bibliography" SelectedStyle="\APASixthEditionOfficeOnline.xsl" StyleName="APA" Version="6"/>
-</file>
-
 <file path=customXml/item4.xml><?xml version="1.0" encoding="utf-8"?>
 <?mso-contentType ?>
 <FormTemplates xmlns="http://schemas.microsoft.com/sharepoint/v3/contenttype/forms">
@@ -5484,6 +5541,26 @@
 </file>
 
 <file path=customXml/itemProps1.xml><?xml version="1.0" encoding="utf-8"?>
+<ds:datastoreItem xmlns:ds="http://schemas.openxmlformats.org/officeDocument/2006/customXml" ds:itemID="{8350094C-0D3E-4E0A-A2D0-7BE047D09FEF}">
+  <ds:schemaRefs>
+    <ds:schemaRef ds:uri="http://schemas.openxmlformats.org/officeDocument/2006/bibliography"/>
+  </ds:schemaRefs>
+</ds:datastoreItem>
+</file>
+
+<file path=customXml/itemProps2.xml><?xml version="1.0" encoding="utf-8"?>
+<ds:datastoreItem xmlns:ds="http://schemas.openxmlformats.org/officeDocument/2006/customXml" ds:itemID="{8798095E-4456-4E45-8445-539B9EDACF3C}">
+  <ds:schemaRefs>
+    <ds:schemaRef ds:uri="http://schemas.microsoft.com/office/2006/metadata/properties"/>
+    <ds:schemaRef ds:uri="http://schemas.microsoft.com/office/infopath/2007/PartnerControls"/>
+    <ds:schemaRef ds:uri="71af3243-3dd4-4a8d-8c0d-dd76da1f02a5"/>
+    <ds:schemaRef ds:uri="http://schemas.microsoft.com/sharepoint/v3"/>
+    <ds:schemaRef ds:uri="230e9df3-be65-4c73-a93b-d1236ebd677e"/>
+  </ds:schemaRefs>
+</ds:datastoreItem>
+</file>
+
+<file path=customXml/itemProps3.xml><?xml version="1.0" encoding="utf-8"?>
 <ds:datastoreItem xmlns:ds="http://schemas.openxmlformats.org/officeDocument/2006/customXml" ds:itemID="{18EB9497-C3FA-44B4-AD7B-A28C824BF395}">
   <ds:schemaRefs>
     <ds:schemaRef ds:uri="http://schemas.microsoft.com/office/2006/metadata/contentType"/>
@@ -5504,26 +5581,6 @@
 </ds:datastoreItem>
 </file>
 
-<file path=customXml/itemProps2.xml><?xml version="1.0" encoding="utf-8"?>
-<ds:datastoreItem xmlns:ds="http://schemas.openxmlformats.org/officeDocument/2006/customXml" ds:itemID="{8798095E-4456-4E45-8445-539B9EDACF3C}">
-  <ds:schemaRefs>
-    <ds:schemaRef ds:uri="http://schemas.microsoft.com/office/2006/metadata/properties"/>
-    <ds:schemaRef ds:uri="http://schemas.microsoft.com/office/infopath/2007/PartnerControls"/>
-    <ds:schemaRef ds:uri="71af3243-3dd4-4a8d-8c0d-dd76da1f02a5"/>
-    <ds:schemaRef ds:uri="http://schemas.microsoft.com/sharepoint/v3"/>
-    <ds:schemaRef ds:uri="230e9df3-be65-4c73-a93b-d1236ebd677e"/>
-  </ds:schemaRefs>
-</ds:datastoreItem>
-</file>
-
-<file path=customXml/itemProps3.xml><?xml version="1.0" encoding="utf-8"?>
-<ds:datastoreItem xmlns:ds="http://schemas.openxmlformats.org/officeDocument/2006/customXml" ds:itemID="{8350094C-0D3E-4E0A-A2D0-7BE047D09FEF}">
-  <ds:schemaRefs>
-    <ds:schemaRef ds:uri="http://schemas.openxmlformats.org/officeDocument/2006/bibliography"/>
-  </ds:schemaRefs>
-</ds:datastoreItem>
-</file>
-
 <file path=customXml/itemProps4.xml><?xml version="1.0" encoding="utf-8"?>
 <ds:datastoreItem xmlns:ds="http://schemas.openxmlformats.org/officeDocument/2006/customXml" ds:itemID="{FC408F27-B5ED-4462-B2CB-58DE6D45B7BD}">
   <ds:schemaRefs>

</xml_diff>

<commit_message>
Api testing on postman
</commit_message>
<xml_diff>
--- a/Internet Programming.docx
+++ b/Internet Programming.docx
@@ -33,7 +33,7 @@
                 <w:lang w:eastAsia="en-AU"/>
               </w:rPr>
               <w:drawing>
-                <wp:inline distT="0" distB="0" distL="0" distR="0" wp14:anchorId="52BC7E4F" wp14:editId="3089235B">
+                <wp:inline distT="0" distB="0" distL="0" distR="0" wp14:anchorId="52BC7E4F" wp14:editId="11B49ABF">
                   <wp:extent cx="6857664" cy="6188799"/>
                   <wp:effectExtent l="0" t="0" r="635" b="2540"/>
                   <wp:docPr id="2" name="Picture 2"/>
@@ -260,7 +260,7 @@
           <w:r>
             <w:fldChar w:fldCharType="separate"/>
           </w:r>
-          <w:hyperlink w:anchor="_Toc227723819" w:history="1">
+          <w:hyperlink w:anchor="_Toc229527506" w:history="1">
             <w:r>
               <w:rPr>
                 <w:rStyle w:val="Hyperlink"/>
@@ -287,7 +287,7 @@
                 <w:noProof/>
                 <w:webHidden/>
               </w:rPr>
-              <w:instrText xml:space="preserve"> PAGEREF _Toc227723819 \h </w:instrText>
+              <w:instrText xml:space="preserve"> PAGEREF _Toc229527506 \h </w:instrText>
             </w:r>
             <w:r>
               <w:rPr>
@@ -333,7 +333,7 @@
               <w14:ligatures w14:val="standardContextual"/>
             </w:rPr>
           </w:pPr>
-          <w:hyperlink w:anchor="_Toc227723820" w:history="1">
+          <w:hyperlink w:anchor="_Toc229527507" w:history="1">
             <w:r>
               <w:rPr>
                 <w:rStyle w:val="Hyperlink"/>
@@ -360,7 +360,7 @@
                 <w:noProof/>
                 <w:webHidden/>
               </w:rPr>
-              <w:instrText xml:space="preserve"> PAGEREF _Toc227723820 \h </w:instrText>
+              <w:instrText xml:space="preserve"> PAGEREF _Toc229527507 \h </w:instrText>
             </w:r>
             <w:r>
               <w:rPr>
@@ -406,7 +406,7 @@
               <w14:ligatures w14:val="standardContextual"/>
             </w:rPr>
           </w:pPr>
-          <w:hyperlink w:anchor="_Toc227723821" w:history="1">
+          <w:hyperlink w:anchor="_Toc229527508" w:history="1">
             <w:r>
               <w:rPr>
                 <w:rStyle w:val="Hyperlink"/>
@@ -433,7 +433,7 @@
                 <w:noProof/>
                 <w:webHidden/>
               </w:rPr>
-              <w:instrText xml:space="preserve"> PAGEREF _Toc227723821 \h </w:instrText>
+              <w:instrText xml:space="preserve"> PAGEREF _Toc229527508 \h </w:instrText>
             </w:r>
             <w:r>
               <w:rPr>
@@ -479,7 +479,7 @@
               <w14:ligatures w14:val="standardContextual"/>
             </w:rPr>
           </w:pPr>
-          <w:hyperlink w:anchor="_Toc227723822" w:history="1">
+          <w:hyperlink w:anchor="_Toc229527509" w:history="1">
             <w:r>
               <w:rPr>
                 <w:rStyle w:val="Hyperlink"/>
@@ -506,7 +506,7 @@
                 <w:noProof/>
                 <w:webHidden/>
               </w:rPr>
-              <w:instrText xml:space="preserve"> PAGEREF _Toc227723822 \h </w:instrText>
+              <w:instrText xml:space="preserve"> PAGEREF _Toc229527509 \h </w:instrText>
             </w:r>
             <w:r>
               <w:rPr>
@@ -552,7 +552,7 @@
               <w14:ligatures w14:val="standardContextual"/>
             </w:rPr>
           </w:pPr>
-          <w:hyperlink w:anchor="_Toc227723823" w:history="1">
+          <w:hyperlink w:anchor="_Toc229527510" w:history="1">
             <w:r>
               <w:rPr>
                 <w:rStyle w:val="Hyperlink"/>
@@ -579,7 +579,7 @@
                 <w:noProof/>
                 <w:webHidden/>
               </w:rPr>
-              <w:instrText xml:space="preserve"> PAGEREF _Toc227723823 \h </w:instrText>
+              <w:instrText xml:space="preserve"> PAGEREF _Toc229527510 \h </w:instrText>
             </w:r>
             <w:r>
               <w:rPr>
@@ -625,7 +625,7 @@
               <w14:ligatures w14:val="standardContextual"/>
             </w:rPr>
           </w:pPr>
-          <w:hyperlink w:anchor="_Toc227723824" w:history="1">
+          <w:hyperlink w:anchor="_Toc229527511" w:history="1">
             <w:r>
               <w:rPr>
                 <w:rStyle w:val="Hyperlink"/>
@@ -652,7 +652,7 @@
                 <w:noProof/>
                 <w:webHidden/>
               </w:rPr>
-              <w:instrText xml:space="preserve"> PAGEREF _Toc227723824 \h </w:instrText>
+              <w:instrText xml:space="preserve"> PAGEREF _Toc229527511 \h </w:instrText>
             </w:r>
             <w:r>
               <w:rPr>
@@ -673,6 +673,517 @@
                 <w:webHidden/>
               </w:rPr>
               <w:t>6</w:t>
+            </w:r>
+            <w:r>
+              <w:rPr>
+                <w:noProof/>
+                <w:webHidden/>
+              </w:rPr>
+              <w:fldChar w:fldCharType="end"/>
+            </w:r>
+          </w:hyperlink>
+        </w:p>
+        <w:p>
+          <w:pPr>
+            <w:pStyle w:val="TOC1"/>
+            <w:tabs>
+              <w:tab w:val="right" w:leader="dot" w:pos="10790"/>
+            </w:tabs>
+            <w:rPr>
+              <w:rFonts w:eastAsiaTheme="minorEastAsia"/>
+              <w:noProof/>
+              <w:kern w:val="2"/>
+              <w:sz w:val="24"/>
+              <w:szCs w:val="24"/>
+              <w14:ligatures w14:val="standardContextual"/>
+            </w:rPr>
+          </w:pPr>
+          <w:hyperlink w:anchor="_Toc229527512" w:history="1">
+            <w:r>
+              <w:rPr>
+                <w:rStyle w:val="Hyperlink"/>
+                <w:noProof/>
+              </w:rPr>
+              <w:t>API Testing</w:t>
+            </w:r>
+            <w:r>
+              <w:rPr>
+                <w:noProof/>
+                <w:webHidden/>
+              </w:rPr>
+              <w:tab/>
+            </w:r>
+            <w:r>
+              <w:rPr>
+                <w:noProof/>
+                <w:webHidden/>
+              </w:rPr>
+              <w:fldChar w:fldCharType="begin"/>
+            </w:r>
+            <w:r>
+              <w:rPr>
+                <w:noProof/>
+                <w:webHidden/>
+              </w:rPr>
+              <w:instrText xml:space="preserve"> PAGEREF _Toc229527512 \h </w:instrText>
+            </w:r>
+            <w:r>
+              <w:rPr>
+                <w:noProof/>
+                <w:webHidden/>
+              </w:rPr>
+            </w:r>
+            <w:r>
+              <w:rPr>
+                <w:noProof/>
+                <w:webHidden/>
+              </w:rPr>
+              <w:fldChar w:fldCharType="separate"/>
+            </w:r>
+            <w:r>
+              <w:rPr>
+                <w:noProof/>
+                <w:webHidden/>
+              </w:rPr>
+              <w:t>7</w:t>
+            </w:r>
+            <w:r>
+              <w:rPr>
+                <w:noProof/>
+                <w:webHidden/>
+              </w:rPr>
+              <w:fldChar w:fldCharType="end"/>
+            </w:r>
+          </w:hyperlink>
+        </w:p>
+        <w:p>
+          <w:pPr>
+            <w:pStyle w:val="TOC2"/>
+            <w:tabs>
+              <w:tab w:val="right" w:leader="dot" w:pos="10790"/>
+            </w:tabs>
+            <w:rPr>
+              <w:rFonts w:eastAsiaTheme="minorEastAsia"/>
+              <w:noProof/>
+              <w:kern w:val="2"/>
+              <w:sz w:val="24"/>
+              <w:szCs w:val="24"/>
+              <w14:ligatures w14:val="standardContextual"/>
+            </w:rPr>
+          </w:pPr>
+          <w:hyperlink w:anchor="_Toc229527513" w:history="1">
+            <w:r>
+              <w:rPr>
+                <w:rStyle w:val="Hyperlink"/>
+                <w:noProof/>
+              </w:rPr>
+              <w:t>1. Auth Routes</w:t>
+            </w:r>
+            <w:r>
+              <w:rPr>
+                <w:noProof/>
+                <w:webHidden/>
+              </w:rPr>
+              <w:tab/>
+            </w:r>
+            <w:r>
+              <w:rPr>
+                <w:noProof/>
+                <w:webHidden/>
+              </w:rPr>
+              <w:fldChar w:fldCharType="begin"/>
+            </w:r>
+            <w:r>
+              <w:rPr>
+                <w:noProof/>
+                <w:webHidden/>
+              </w:rPr>
+              <w:instrText xml:space="preserve"> PAGEREF _Toc229527513 \h </w:instrText>
+            </w:r>
+            <w:r>
+              <w:rPr>
+                <w:noProof/>
+                <w:webHidden/>
+              </w:rPr>
+            </w:r>
+            <w:r>
+              <w:rPr>
+                <w:noProof/>
+                <w:webHidden/>
+              </w:rPr>
+              <w:fldChar w:fldCharType="separate"/>
+            </w:r>
+            <w:r>
+              <w:rPr>
+                <w:noProof/>
+                <w:webHidden/>
+              </w:rPr>
+              <w:t>7</w:t>
+            </w:r>
+            <w:r>
+              <w:rPr>
+                <w:noProof/>
+                <w:webHidden/>
+              </w:rPr>
+              <w:fldChar w:fldCharType="end"/>
+            </w:r>
+          </w:hyperlink>
+        </w:p>
+        <w:p>
+          <w:pPr>
+            <w:pStyle w:val="TOC2"/>
+            <w:tabs>
+              <w:tab w:val="right" w:leader="dot" w:pos="10790"/>
+            </w:tabs>
+            <w:rPr>
+              <w:rFonts w:eastAsiaTheme="minorEastAsia"/>
+              <w:noProof/>
+              <w:kern w:val="2"/>
+              <w:sz w:val="24"/>
+              <w:szCs w:val="24"/>
+              <w14:ligatures w14:val="standardContextual"/>
+            </w:rPr>
+          </w:pPr>
+          <w:hyperlink w:anchor="_Toc229527514" w:history="1">
+            <w:r>
+              <w:rPr>
+                <w:rStyle w:val="Hyperlink"/>
+                <w:noProof/>
+              </w:rPr>
+              <w:t>2. Community Routes</w:t>
+            </w:r>
+            <w:r>
+              <w:rPr>
+                <w:noProof/>
+                <w:webHidden/>
+              </w:rPr>
+              <w:tab/>
+            </w:r>
+            <w:r>
+              <w:rPr>
+                <w:noProof/>
+                <w:webHidden/>
+              </w:rPr>
+              <w:fldChar w:fldCharType="begin"/>
+            </w:r>
+            <w:r>
+              <w:rPr>
+                <w:noProof/>
+                <w:webHidden/>
+              </w:rPr>
+              <w:instrText xml:space="preserve"> PAGEREF _Toc229527514 \h </w:instrText>
+            </w:r>
+            <w:r>
+              <w:rPr>
+                <w:noProof/>
+                <w:webHidden/>
+              </w:rPr>
+            </w:r>
+            <w:r>
+              <w:rPr>
+                <w:noProof/>
+                <w:webHidden/>
+              </w:rPr>
+              <w:fldChar w:fldCharType="separate"/>
+            </w:r>
+            <w:r>
+              <w:rPr>
+                <w:noProof/>
+                <w:webHidden/>
+              </w:rPr>
+              <w:t>10</w:t>
+            </w:r>
+            <w:r>
+              <w:rPr>
+                <w:noProof/>
+                <w:webHidden/>
+              </w:rPr>
+              <w:fldChar w:fldCharType="end"/>
+            </w:r>
+          </w:hyperlink>
+        </w:p>
+        <w:p>
+          <w:pPr>
+            <w:pStyle w:val="TOC2"/>
+            <w:tabs>
+              <w:tab w:val="right" w:leader="dot" w:pos="10790"/>
+            </w:tabs>
+            <w:rPr>
+              <w:rFonts w:eastAsiaTheme="minorEastAsia"/>
+              <w:noProof/>
+              <w:kern w:val="2"/>
+              <w:sz w:val="24"/>
+              <w:szCs w:val="24"/>
+              <w14:ligatures w14:val="standardContextual"/>
+            </w:rPr>
+          </w:pPr>
+          <w:hyperlink w:anchor="_Toc229527515" w:history="1">
+            <w:r>
+              <w:rPr>
+                <w:rStyle w:val="Hyperlink"/>
+                <w:noProof/>
+              </w:rPr>
+              <w:t>3. Posts Routes</w:t>
+            </w:r>
+            <w:r>
+              <w:rPr>
+                <w:noProof/>
+                <w:webHidden/>
+              </w:rPr>
+              <w:tab/>
+            </w:r>
+            <w:r>
+              <w:rPr>
+                <w:noProof/>
+                <w:webHidden/>
+              </w:rPr>
+              <w:fldChar w:fldCharType="begin"/>
+            </w:r>
+            <w:r>
+              <w:rPr>
+                <w:noProof/>
+                <w:webHidden/>
+              </w:rPr>
+              <w:instrText xml:space="preserve"> PAGEREF _Toc229527515 \h </w:instrText>
+            </w:r>
+            <w:r>
+              <w:rPr>
+                <w:noProof/>
+                <w:webHidden/>
+              </w:rPr>
+            </w:r>
+            <w:r>
+              <w:rPr>
+                <w:noProof/>
+                <w:webHidden/>
+              </w:rPr>
+              <w:fldChar w:fldCharType="separate"/>
+            </w:r>
+            <w:r>
+              <w:rPr>
+                <w:noProof/>
+                <w:webHidden/>
+              </w:rPr>
+              <w:t>12</w:t>
+            </w:r>
+            <w:r>
+              <w:rPr>
+                <w:noProof/>
+                <w:webHidden/>
+              </w:rPr>
+              <w:fldChar w:fldCharType="end"/>
+            </w:r>
+          </w:hyperlink>
+        </w:p>
+        <w:p>
+          <w:pPr>
+            <w:pStyle w:val="TOC2"/>
+            <w:tabs>
+              <w:tab w:val="right" w:leader="dot" w:pos="10790"/>
+            </w:tabs>
+            <w:rPr>
+              <w:rFonts w:eastAsiaTheme="minorEastAsia"/>
+              <w:noProof/>
+              <w:kern w:val="2"/>
+              <w:sz w:val="24"/>
+              <w:szCs w:val="24"/>
+              <w14:ligatures w14:val="standardContextual"/>
+            </w:rPr>
+          </w:pPr>
+          <w:hyperlink w:anchor="_Toc229527516" w:history="1">
+            <w:r>
+              <w:rPr>
+                <w:rStyle w:val="Hyperlink"/>
+                <w:noProof/>
+              </w:rPr>
+              <w:t>4. Votes Routes</w:t>
+            </w:r>
+            <w:r>
+              <w:rPr>
+                <w:noProof/>
+                <w:webHidden/>
+              </w:rPr>
+              <w:tab/>
+            </w:r>
+            <w:r>
+              <w:rPr>
+                <w:noProof/>
+                <w:webHidden/>
+              </w:rPr>
+              <w:fldChar w:fldCharType="begin"/>
+            </w:r>
+            <w:r>
+              <w:rPr>
+                <w:noProof/>
+                <w:webHidden/>
+              </w:rPr>
+              <w:instrText xml:space="preserve"> PAGEREF _Toc229527516 \h </w:instrText>
+            </w:r>
+            <w:r>
+              <w:rPr>
+                <w:noProof/>
+                <w:webHidden/>
+              </w:rPr>
+            </w:r>
+            <w:r>
+              <w:rPr>
+                <w:noProof/>
+                <w:webHidden/>
+              </w:rPr>
+              <w:fldChar w:fldCharType="separate"/>
+            </w:r>
+            <w:r>
+              <w:rPr>
+                <w:noProof/>
+                <w:webHidden/>
+              </w:rPr>
+              <w:t>14</w:t>
+            </w:r>
+            <w:r>
+              <w:rPr>
+                <w:noProof/>
+                <w:webHidden/>
+              </w:rPr>
+              <w:fldChar w:fldCharType="end"/>
+            </w:r>
+          </w:hyperlink>
+        </w:p>
+        <w:p>
+          <w:pPr>
+            <w:pStyle w:val="TOC2"/>
+            <w:tabs>
+              <w:tab w:val="right" w:leader="dot" w:pos="10790"/>
+            </w:tabs>
+            <w:rPr>
+              <w:rFonts w:eastAsiaTheme="minorEastAsia"/>
+              <w:noProof/>
+              <w:kern w:val="2"/>
+              <w:sz w:val="24"/>
+              <w:szCs w:val="24"/>
+              <w14:ligatures w14:val="standardContextual"/>
+            </w:rPr>
+          </w:pPr>
+          <w:hyperlink w:anchor="_Toc229527517" w:history="1">
+            <w:r>
+              <w:rPr>
+                <w:rStyle w:val="Hyperlink"/>
+                <w:noProof/>
+              </w:rPr>
+              <w:t>5. Comments Routes</w:t>
+            </w:r>
+            <w:r>
+              <w:rPr>
+                <w:noProof/>
+                <w:webHidden/>
+              </w:rPr>
+              <w:tab/>
+            </w:r>
+            <w:r>
+              <w:rPr>
+                <w:noProof/>
+                <w:webHidden/>
+              </w:rPr>
+              <w:fldChar w:fldCharType="begin"/>
+            </w:r>
+            <w:r>
+              <w:rPr>
+                <w:noProof/>
+                <w:webHidden/>
+              </w:rPr>
+              <w:instrText xml:space="preserve"> PAGEREF _Toc229527517 \h </w:instrText>
+            </w:r>
+            <w:r>
+              <w:rPr>
+                <w:noProof/>
+                <w:webHidden/>
+              </w:rPr>
+            </w:r>
+            <w:r>
+              <w:rPr>
+                <w:noProof/>
+                <w:webHidden/>
+              </w:rPr>
+              <w:fldChar w:fldCharType="separate"/>
+            </w:r>
+            <w:r>
+              <w:rPr>
+                <w:noProof/>
+                <w:webHidden/>
+              </w:rPr>
+              <w:t>15</w:t>
+            </w:r>
+            <w:r>
+              <w:rPr>
+                <w:noProof/>
+                <w:webHidden/>
+              </w:rPr>
+              <w:fldChar w:fldCharType="end"/>
+            </w:r>
+          </w:hyperlink>
+        </w:p>
+        <w:p>
+          <w:pPr>
+            <w:pStyle w:val="TOC2"/>
+            <w:tabs>
+              <w:tab w:val="right" w:leader="dot" w:pos="10790"/>
+            </w:tabs>
+            <w:rPr>
+              <w:rFonts w:eastAsiaTheme="minorEastAsia"/>
+              <w:noProof/>
+              <w:kern w:val="2"/>
+              <w:sz w:val="24"/>
+              <w:szCs w:val="24"/>
+              <w14:ligatures w14:val="standardContextual"/>
+            </w:rPr>
+          </w:pPr>
+          <w:hyperlink w:anchor="_Toc229527518" w:history="1">
+            <w:r>
+              <w:rPr>
+                <w:rStyle w:val="Hyperlink"/>
+                <w:noProof/>
+              </w:rPr>
+              <w:t>6. Post Summary</w:t>
+            </w:r>
+            <w:r>
+              <w:rPr>
+                <w:noProof/>
+                <w:webHidden/>
+              </w:rPr>
+              <w:tab/>
+            </w:r>
+            <w:r>
+              <w:rPr>
+                <w:noProof/>
+                <w:webHidden/>
+              </w:rPr>
+              <w:fldChar w:fldCharType="begin"/>
+            </w:r>
+            <w:r>
+              <w:rPr>
+                <w:noProof/>
+                <w:webHidden/>
+              </w:rPr>
+              <w:instrText xml:space="preserve"> PAGEREF _Toc229527518 \h </w:instrText>
+            </w:r>
+            <w:r>
+              <w:rPr>
+                <w:noProof/>
+                <w:webHidden/>
+              </w:rPr>
+            </w:r>
+            <w:r>
+              <w:rPr>
+                <w:noProof/>
+                <w:webHidden/>
+              </w:rPr>
+              <w:fldChar w:fldCharType="separate"/>
+            </w:r>
+            <w:r>
+              <w:rPr>
+                <w:noProof/>
+                <w:webHidden/>
+              </w:rPr>
+              <w:t>16</w:t>
             </w:r>
             <w:r>
               <w:rPr>
@@ -727,21 +1238,11 @@
     <w:p/>
     <w:p/>
     <w:p/>
-    <w:p/>
-    <w:p/>
-    <w:p/>
-    <w:p/>
-    <w:p/>
-    <w:p/>
-    <w:p/>
-    <w:p/>
-    <w:p/>
-    <w:p/>
     <w:p>
       <w:pPr>
         <w:pStyle w:val="Heading1"/>
       </w:pPr>
-      <w:bookmarkStart w:id="0" w:name="_Toc227723819"/>
+      <w:bookmarkStart w:id="0" w:name="_Toc229527506"/>
       <w:r>
         <w:lastRenderedPageBreak/>
         <w:t>Introduction</w:t>
@@ -812,7 +1313,7 @@
       <w:pPr>
         <w:pStyle w:val="Heading1"/>
       </w:pPr>
-      <w:bookmarkStart w:id="1" w:name="_Toc227723820"/>
+      <w:bookmarkStart w:id="1" w:name="_Toc229527507"/>
       <w:r>
         <w:lastRenderedPageBreak/>
         <w:t>Product Backlog</w:t>
@@ -823,7 +1324,7 @@
       <w:pPr>
         <w:pStyle w:val="Heading2"/>
       </w:pPr>
-      <w:bookmarkStart w:id="2" w:name="_Toc227723821"/>
+      <w:bookmarkStart w:id="2" w:name="_Toc229527508"/>
       <w:r>
         <w:t>Us</w:t>
       </w:r>
@@ -944,11 +1445,14 @@
     <w:p/>
     <w:p/>
     <w:p/>
+    <w:p/>
+    <w:p/>
+    <w:p/>
     <w:p>
       <w:pPr>
         <w:pStyle w:val="Heading2"/>
       </w:pPr>
-      <w:bookmarkStart w:id="3" w:name="_Toc227723822"/>
+      <w:bookmarkStart w:id="3" w:name="_Toc229527509"/>
       <w:r>
         <w:lastRenderedPageBreak/>
         <w:t>Sprints</w:t>
@@ -959,7 +1463,7 @@
       <w:pPr>
         <w:pStyle w:val="Heading3"/>
       </w:pPr>
-      <w:bookmarkStart w:id="4" w:name="_Toc227723823"/>
+      <w:bookmarkStart w:id="4" w:name="_Toc229527510"/>
       <w:r>
         <w:t>Sprint 1:</w:t>
       </w:r>
@@ -1094,21 +1598,13 @@
     <w:p/>
     <w:p/>
     <w:p/>
-    <w:p/>
-    <w:p/>
-    <w:p/>
-    <w:p/>
-    <w:p/>
-    <w:p/>
-    <w:p/>
-    <w:p/>
-    <w:p/>
     <w:p>
       <w:pPr>
         <w:pStyle w:val="Heading1"/>
       </w:pPr>
-      <w:bookmarkStart w:id="5" w:name="_Toc227723824"/>
+      <w:bookmarkStart w:id="5" w:name="_Toc229527511"/>
       <w:r>
+        <w:lastRenderedPageBreak/>
         <w:t>Database design</w:t>
       </w:r>
       <w:bookmarkEnd w:id="5"/>
@@ -1163,10 +1659,1280 @@
     </w:p>
     <w:p/>
     <w:p/>
+    <w:p/>
+    <w:p/>
+    <w:p/>
+    <w:p/>
+    <w:p/>
+    <w:p/>
+    <w:p/>
+    <w:p/>
+    <w:p/>
+    <w:p/>
+    <w:p/>
+    <w:p/>
+    <w:p/>
+    <w:p/>
+    <w:p/>
+    <w:p/>
+    <w:p/>
+    <w:p/>
+    <w:p/>
+    <w:p/>
+    <w:p/>
+    <w:p/>
+    <w:p/>
+    <w:p/>
+    <w:p/>
+    <w:p/>
+    <w:p/>
+    <w:p/>
+    <w:p/>
+    <w:p>
+      <w:pPr>
+        <w:pStyle w:val="Heading1"/>
+      </w:pPr>
+      <w:bookmarkStart w:id="6" w:name="_Toc229527512"/>
+      <w:r>
+        <w:lastRenderedPageBreak/>
+        <w:t>API Testing</w:t>
+      </w:r>
+      <w:bookmarkEnd w:id="6"/>
+    </w:p>
+    <w:p>
+      <w:pPr>
+        <w:pStyle w:val="Heading2"/>
+      </w:pPr>
+      <w:bookmarkStart w:id="7" w:name="_Toc229527513"/>
+      <w:r>
+        <w:t>Auth Routes</w:t>
+      </w:r>
+      <w:bookmarkEnd w:id="7"/>
+    </w:p>
+    <w:p>
+      <w:r>
+        <w:rPr>
+          <w:b/>
+          <w:bCs/>
+        </w:rPr>
+        <w:t>Register</w:t>
+      </w:r>
+    </w:p>
+    <w:p>
+      <w:pPr>
+        <w:numPr>
+          <w:ilvl w:val="0"/>
+          <w:numId w:val="22"/>
+        </w:numPr>
+      </w:pPr>
+      <w:r>
+        <w:t>POST http://localhost:5001/api/auth/register</w:t>
+      </w:r>
+    </w:p>
+    <w:p/>
+    <w:p>
+      <w:r>
+        <w:rPr>
+          <w:noProof/>
+        </w:rPr>
+        <w:drawing>
+          <wp:inline distT="0" distB="0" distL="0" distR="0" wp14:anchorId="3E43B242" wp14:editId="7183824C">
+            <wp:extent cx="5371892" cy="5324475"/>
+            <wp:effectExtent l="0" t="0" r="635" b="0"/>
+            <wp:docPr id="898071234" name="Picture 1"/>
+            <wp:cNvGraphicFramePr>
+              <a:graphicFrameLocks xmlns:a="http://schemas.openxmlformats.org/drawingml/2006/main" noChangeAspect="1"/>
+            </wp:cNvGraphicFramePr>
+            <a:graphic xmlns:a="http://schemas.openxmlformats.org/drawingml/2006/main">
+              <a:graphicData uri="http://schemas.openxmlformats.org/drawingml/2006/picture">
+                <pic:pic xmlns:pic="http://schemas.openxmlformats.org/drawingml/2006/picture">
+                  <pic:nvPicPr>
+                    <pic:cNvPr id="898071234" name="Picture 898071234"/>
+                    <pic:cNvPicPr/>
+                  </pic:nvPicPr>
+                  <pic:blipFill>
+                    <a:blip r:embed="rId18">
+                      <a:extLst>
+                        <a:ext uri="{28A0092B-C50C-407E-A947-70E740481C1C}">
+                          <a14:useLocalDpi xmlns:a14="http://schemas.microsoft.com/office/drawing/2010/main" val="0"/>
+                        </a:ext>
+                      </a:extLst>
+                    </a:blip>
+                    <a:stretch>
+                      <a:fillRect/>
+                    </a:stretch>
+                  </pic:blipFill>
+                  <pic:spPr>
+                    <a:xfrm>
+                      <a:off x="0" y="0"/>
+                      <a:ext cx="5392316" cy="5344718"/>
+                    </a:xfrm>
+                    <a:prstGeom prst="rect">
+                      <a:avLst/>
+                    </a:prstGeom>
+                  </pic:spPr>
+                </pic:pic>
+              </a:graphicData>
+            </a:graphic>
+          </wp:inline>
+        </w:drawing>
+      </w:r>
+    </w:p>
+    <w:p/>
+    <w:p/>
+    <w:p/>
+    <w:p/>
+    <w:p/>
+    <w:p/>
+    <w:p/>
+    <w:p/>
+    <w:p/>
+    <w:p/>
+    <w:p/>
+    <w:p/>
+    <w:p/>
+    <w:p>
+      <w:r>
+        <w:rPr>
+          <w:noProof/>
+        </w:rPr>
+        <w:lastRenderedPageBreak/>
+        <w:drawing>
+          <wp:anchor distT="0" distB="0" distL="114300" distR="114300" simplePos="0" relativeHeight="251658240" behindDoc="0" locked="0" layoutInCell="1" allowOverlap="1" wp14:anchorId="1CF88CC8" wp14:editId="3F9E0349">
+            <wp:simplePos x="0" y="0"/>
+            <wp:positionH relativeFrom="margin">
+              <wp:align>left</wp:align>
+            </wp:positionH>
+            <wp:positionV relativeFrom="paragraph">
+              <wp:posOffset>883920</wp:posOffset>
+            </wp:positionV>
+            <wp:extent cx="5050741" cy="4685030"/>
+            <wp:effectExtent l="0" t="0" r="0" b="1270"/>
+            <wp:wrapTopAndBottom/>
+            <wp:docPr id="1788712741" name="Picture 2"/>
+            <wp:cNvGraphicFramePr>
+              <a:graphicFrameLocks xmlns:a="http://schemas.openxmlformats.org/drawingml/2006/main" noChangeAspect="1"/>
+            </wp:cNvGraphicFramePr>
+            <a:graphic xmlns:a="http://schemas.openxmlformats.org/drawingml/2006/main">
+              <a:graphicData uri="http://schemas.openxmlformats.org/drawingml/2006/picture">
+                <pic:pic xmlns:pic="http://schemas.openxmlformats.org/drawingml/2006/picture">
+                  <pic:nvPicPr>
+                    <pic:cNvPr id="1788712741" name="Picture 1788712741"/>
+                    <pic:cNvPicPr/>
+                  </pic:nvPicPr>
+                  <pic:blipFill>
+                    <a:blip r:embed="rId19">
+                      <a:extLst>
+                        <a:ext uri="{28A0092B-C50C-407E-A947-70E740481C1C}">
+                          <a14:useLocalDpi xmlns:a14="http://schemas.microsoft.com/office/drawing/2010/main" val="0"/>
+                        </a:ext>
+                      </a:extLst>
+                    </a:blip>
+                    <a:stretch>
+                      <a:fillRect/>
+                    </a:stretch>
+                  </pic:blipFill>
+                  <pic:spPr>
+                    <a:xfrm>
+                      <a:off x="0" y="0"/>
+                      <a:ext cx="5050741" cy="4685030"/>
+                    </a:xfrm>
+                    <a:prstGeom prst="rect">
+                      <a:avLst/>
+                    </a:prstGeom>
+                  </pic:spPr>
+                </pic:pic>
+              </a:graphicData>
+            </a:graphic>
+          </wp:anchor>
+        </w:drawing>
+      </w:r>
+    </w:p>
+    <w:p/>
+    <w:p>
+      <w:r>
+        <w:rPr>
+          <w:b/>
+          <w:bCs/>
+        </w:rPr>
+        <w:t>Login</w:t>
+      </w:r>
+    </w:p>
+    <w:p>
+      <w:pPr>
+        <w:numPr>
+          <w:ilvl w:val="0"/>
+          <w:numId w:val="23"/>
+        </w:numPr>
+      </w:pPr>
+      <w:r>
+        <w:t>POST http://localhost:5001/api/auth/login</w:t>
+      </w:r>
+    </w:p>
+    <w:p/>
+    <w:p/>
+    <w:p/>
+    <w:p/>
+    <w:p/>
+    <w:p/>
+    <w:p/>
+    <w:p/>
+    <w:p/>
+    <w:p/>
+    <w:p/>
+    <w:p/>
+    <w:p/>
+    <w:p/>
+    <w:p/>
+    <w:p/>
+    <w:p/>
+    <w:p/>
+    <w:p/>
+    <w:p/>
+    <w:p/>
+    <w:p>
+      <w:pPr>
+        <w:pStyle w:val="Heading2"/>
+        <w:rPr>
+          <w:noProof/>
+        </w:rPr>
+      </w:pPr>
+      <w:bookmarkStart w:id="8" w:name="_Toc229527514"/>
+      <w:r>
+        <w:rPr>
+          <w:noProof/>
+        </w:rPr>
+        <w:lastRenderedPageBreak/>
+        <w:t>Community Routes</w:t>
+      </w:r>
+      <w:bookmarkEnd w:id="8"/>
+    </w:p>
+    <w:p>
+      <w:pPr>
+        <w:rPr>
+          <w:noProof/>
+        </w:rPr>
+      </w:pPr>
+      <w:r>
+        <w:rPr>
+          <w:b/>
+          <w:bCs/>
+          <w:noProof/>
+        </w:rPr>
+        <w:t>Get All Communities</w:t>
+      </w:r>
+    </w:p>
+    <w:p>
+      <w:pPr>
+        <w:numPr>
+          <w:ilvl w:val="0"/>
+          <w:numId w:val="24"/>
+        </w:numPr>
+        <w:rPr>
+          <w:noProof/>
+        </w:rPr>
+      </w:pPr>
+      <w:r>
+        <w:rPr>
+          <w:noProof/>
+        </w:rPr>
+        <w:drawing>
+          <wp:anchor distT="0" distB="0" distL="114300" distR="114300" simplePos="0" relativeHeight="251659264" behindDoc="0" locked="0" layoutInCell="1" allowOverlap="1" wp14:anchorId="116215E3" wp14:editId="6FD8AF98">
+            <wp:simplePos x="0" y="0"/>
+            <wp:positionH relativeFrom="margin">
+              <wp:posOffset>1150620</wp:posOffset>
+            </wp:positionH>
+            <wp:positionV relativeFrom="paragraph">
+              <wp:posOffset>217170</wp:posOffset>
+            </wp:positionV>
+            <wp:extent cx="4655820" cy="4139565"/>
+            <wp:effectExtent l="0" t="0" r="0" b="0"/>
+            <wp:wrapTopAndBottom/>
+            <wp:docPr id="982819066" name="Picture 3"/>
+            <wp:cNvGraphicFramePr>
+              <a:graphicFrameLocks xmlns:a="http://schemas.openxmlformats.org/drawingml/2006/main" noChangeAspect="1"/>
+            </wp:cNvGraphicFramePr>
+            <a:graphic xmlns:a="http://schemas.openxmlformats.org/drawingml/2006/main">
+              <a:graphicData uri="http://schemas.openxmlformats.org/drawingml/2006/picture">
+                <pic:pic xmlns:pic="http://schemas.openxmlformats.org/drawingml/2006/picture">
+                  <pic:nvPicPr>
+                    <pic:cNvPr id="982819066" name="Picture 982819066"/>
+                    <pic:cNvPicPr/>
+                  </pic:nvPicPr>
+                  <pic:blipFill>
+                    <a:blip r:embed="rId20">
+                      <a:extLst>
+                        <a:ext uri="{28A0092B-C50C-407E-A947-70E740481C1C}">
+                          <a14:useLocalDpi xmlns:a14="http://schemas.microsoft.com/office/drawing/2010/main" val="0"/>
+                        </a:ext>
+                      </a:extLst>
+                    </a:blip>
+                    <a:stretch>
+                      <a:fillRect/>
+                    </a:stretch>
+                  </pic:blipFill>
+                  <pic:spPr>
+                    <a:xfrm>
+                      <a:off x="0" y="0"/>
+                      <a:ext cx="4655820" cy="4139565"/>
+                    </a:xfrm>
+                    <a:prstGeom prst="rect">
+                      <a:avLst/>
+                    </a:prstGeom>
+                  </pic:spPr>
+                </pic:pic>
+              </a:graphicData>
+            </a:graphic>
+            <wp14:sizeRelH relativeFrom="margin">
+              <wp14:pctWidth>0</wp14:pctWidth>
+            </wp14:sizeRelH>
+            <wp14:sizeRelV relativeFrom="margin">
+              <wp14:pctHeight>0</wp14:pctHeight>
+            </wp14:sizeRelV>
+          </wp:anchor>
+        </w:drawing>
+      </w:r>
+      <w:r>
+        <w:rPr>
+          <w:noProof/>
+        </w:rPr>
+        <w:drawing>
+          <wp:anchor distT="0" distB="0" distL="114300" distR="114300" simplePos="0" relativeHeight="251660288" behindDoc="0" locked="0" layoutInCell="1" allowOverlap="1" wp14:anchorId="6906DE41" wp14:editId="6B4A1BE5">
+            <wp:simplePos x="0" y="0"/>
+            <wp:positionH relativeFrom="margin">
+              <wp:align>center</wp:align>
+            </wp:positionH>
+            <wp:positionV relativeFrom="paragraph">
+              <wp:posOffset>5409565</wp:posOffset>
+            </wp:positionV>
+            <wp:extent cx="5092065" cy="3516630"/>
+            <wp:effectExtent l="0" t="0" r="0" b="7620"/>
+            <wp:wrapTopAndBottom/>
+            <wp:docPr id="1401307857" name="Picture 4"/>
+            <wp:cNvGraphicFramePr>
+              <a:graphicFrameLocks xmlns:a="http://schemas.openxmlformats.org/drawingml/2006/main" noChangeAspect="1"/>
+            </wp:cNvGraphicFramePr>
+            <a:graphic xmlns:a="http://schemas.openxmlformats.org/drawingml/2006/main">
+              <a:graphicData uri="http://schemas.openxmlformats.org/drawingml/2006/picture">
+                <pic:pic xmlns:pic="http://schemas.openxmlformats.org/drawingml/2006/picture">
+                  <pic:nvPicPr>
+                    <pic:cNvPr id="1401307857" name="Picture 1401307857"/>
+                    <pic:cNvPicPr/>
+                  </pic:nvPicPr>
+                  <pic:blipFill>
+                    <a:blip r:embed="rId21">
+                      <a:extLst>
+                        <a:ext uri="{28A0092B-C50C-407E-A947-70E740481C1C}">
+                          <a14:useLocalDpi xmlns:a14="http://schemas.microsoft.com/office/drawing/2010/main" val="0"/>
+                        </a:ext>
+                      </a:extLst>
+                    </a:blip>
+                    <a:stretch>
+                      <a:fillRect/>
+                    </a:stretch>
+                  </pic:blipFill>
+                  <pic:spPr>
+                    <a:xfrm>
+                      <a:off x="0" y="0"/>
+                      <a:ext cx="5092065" cy="3516630"/>
+                    </a:xfrm>
+                    <a:prstGeom prst="rect">
+                      <a:avLst/>
+                    </a:prstGeom>
+                  </pic:spPr>
+                </pic:pic>
+              </a:graphicData>
+            </a:graphic>
+          </wp:anchor>
+        </w:drawing>
+      </w:r>
+      <w:r>
+        <w:rPr>
+          <w:noProof/>
+        </w:rPr>
+        <w:t>GET http://localhost:5001/api/community/communities</w:t>
+      </w:r>
+    </w:p>
+    <w:p/>
+    <w:p/>
+    <w:p>
+      <w:pPr>
+        <w:tabs>
+          <w:tab w:val="left" w:pos="5920"/>
+        </w:tabs>
+      </w:pPr>
+      <w:r>
+        <w:rPr>
+          <w:b/>
+          <w:bCs/>
+        </w:rPr>
+        <w:t>Get Community by Name</w:t>
+      </w:r>
+    </w:p>
+    <w:p>
+      <w:pPr>
+        <w:numPr>
+          <w:ilvl w:val="0"/>
+          <w:numId w:val="25"/>
+        </w:numPr>
+        <w:tabs>
+          <w:tab w:val="left" w:pos="5920"/>
+        </w:tabs>
+        <w:jc w:val="both"/>
+      </w:pPr>
+      <w:r>
+        <w:t>GET http://localhost:5001/api/community/communities/name/testcommunity</w:t>
+      </w:r>
+    </w:p>
+    <w:p>
+      <w:pPr>
+        <w:tabs>
+          <w:tab w:val="left" w:pos="5920"/>
+        </w:tabs>
+        <w:jc w:val="both"/>
+      </w:pPr>
+    </w:p>
+    <w:p>
+      <w:r>
+        <w:rPr>
+          <w:b/>
+          <w:bCs/>
+        </w:rPr>
+        <w:t>Create Community</w:t>
+      </w:r>
+    </w:p>
+    <w:p>
+      <w:pPr>
+        <w:numPr>
+          <w:ilvl w:val="0"/>
+          <w:numId w:val="26"/>
+        </w:numPr>
+      </w:pPr>
+      <w:r>
+        <w:t>POST http://localhost:5001/api/community/communities</w:t>
+      </w:r>
+    </w:p>
+    <w:p/>
+    <w:p>
+      <w:r>
+        <w:rPr>
+          <w:noProof/>
+        </w:rPr>
+        <w:drawing>
+          <wp:inline distT="0" distB="0" distL="0" distR="0" wp14:anchorId="567B138F" wp14:editId="6A6E29B0">
+            <wp:extent cx="6461881" cy="4236720"/>
+            <wp:effectExtent l="0" t="0" r="0" b="0"/>
+            <wp:docPr id="445216478" name="Picture 5"/>
+            <wp:cNvGraphicFramePr>
+              <a:graphicFrameLocks xmlns:a="http://schemas.openxmlformats.org/drawingml/2006/main" noChangeAspect="1"/>
+            </wp:cNvGraphicFramePr>
+            <a:graphic xmlns:a="http://schemas.openxmlformats.org/drawingml/2006/main">
+              <a:graphicData uri="http://schemas.openxmlformats.org/drawingml/2006/picture">
+                <pic:pic xmlns:pic="http://schemas.openxmlformats.org/drawingml/2006/picture">
+                  <pic:nvPicPr>
+                    <pic:cNvPr id="445216478" name="Picture 445216478"/>
+                    <pic:cNvPicPr/>
+                  </pic:nvPicPr>
+                  <pic:blipFill>
+                    <a:blip r:embed="rId22">
+                      <a:extLst>
+                        <a:ext uri="{28A0092B-C50C-407E-A947-70E740481C1C}">
+                          <a14:useLocalDpi xmlns:a14="http://schemas.microsoft.com/office/drawing/2010/main" val="0"/>
+                        </a:ext>
+                      </a:extLst>
+                    </a:blip>
+                    <a:stretch>
+                      <a:fillRect/>
+                    </a:stretch>
+                  </pic:blipFill>
+                  <pic:spPr>
+                    <a:xfrm>
+                      <a:off x="0" y="0"/>
+                      <a:ext cx="6463835" cy="4238001"/>
+                    </a:xfrm>
+                    <a:prstGeom prst="rect">
+                      <a:avLst/>
+                    </a:prstGeom>
+                  </pic:spPr>
+                </pic:pic>
+              </a:graphicData>
+            </a:graphic>
+          </wp:inline>
+        </w:drawing>
+      </w:r>
+    </w:p>
+    <w:p/>
+    <w:p/>
+    <w:p>
+      <w:r>
+        <w:rPr>
+          <w:b/>
+          <w:bCs/>
+        </w:rPr>
+        <w:t>Leave Community</w:t>
+      </w:r>
+    </w:p>
+    <w:p>
+      <w:pPr>
+        <w:numPr>
+          <w:ilvl w:val="0"/>
+          <w:numId w:val="27"/>
+        </w:numPr>
+      </w:pPr>
+      <w:r>
+        <w:t>DELETE http://localhost:5001/api/community/communities/COMMUNITY_ID/leave</w:t>
+      </w:r>
+    </w:p>
+    <w:p>
+      <w:r>
+        <w:rPr>
+          <w:noProof/>
+        </w:rPr>
+        <w:drawing>
+          <wp:anchor distT="0" distB="0" distL="114300" distR="114300" simplePos="0" relativeHeight="251661312" behindDoc="0" locked="0" layoutInCell="1" allowOverlap="1" wp14:anchorId="65A1172B" wp14:editId="39D312E5">
+            <wp:simplePos x="0" y="0"/>
+            <wp:positionH relativeFrom="margin">
+              <wp:align>right</wp:align>
+            </wp:positionH>
+            <wp:positionV relativeFrom="paragraph">
+              <wp:posOffset>188595</wp:posOffset>
+            </wp:positionV>
+            <wp:extent cx="6858000" cy="3314065"/>
+            <wp:effectExtent l="0" t="0" r="0" b="635"/>
+            <wp:wrapTopAndBottom/>
+            <wp:docPr id="2090353378" name="Picture 6"/>
+            <wp:cNvGraphicFramePr>
+              <a:graphicFrameLocks xmlns:a="http://schemas.openxmlformats.org/drawingml/2006/main" noChangeAspect="1"/>
+            </wp:cNvGraphicFramePr>
+            <a:graphic xmlns:a="http://schemas.openxmlformats.org/drawingml/2006/main">
+              <a:graphicData uri="http://schemas.openxmlformats.org/drawingml/2006/picture">
+                <pic:pic xmlns:pic="http://schemas.openxmlformats.org/drawingml/2006/picture">
+                  <pic:nvPicPr>
+                    <pic:cNvPr id="2090353378" name="Picture 2090353378"/>
+                    <pic:cNvPicPr/>
+                  </pic:nvPicPr>
+                  <pic:blipFill>
+                    <a:blip r:embed="rId23">
+                      <a:extLst>
+                        <a:ext uri="{28A0092B-C50C-407E-A947-70E740481C1C}">
+                          <a14:useLocalDpi xmlns:a14="http://schemas.microsoft.com/office/drawing/2010/main" val="0"/>
+                        </a:ext>
+                      </a:extLst>
+                    </a:blip>
+                    <a:stretch>
+                      <a:fillRect/>
+                    </a:stretch>
+                  </pic:blipFill>
+                  <pic:spPr>
+                    <a:xfrm>
+                      <a:off x="0" y="0"/>
+                      <a:ext cx="6858000" cy="3314065"/>
+                    </a:xfrm>
+                    <a:prstGeom prst="rect">
+                      <a:avLst/>
+                    </a:prstGeom>
+                  </pic:spPr>
+                </pic:pic>
+              </a:graphicData>
+            </a:graphic>
+          </wp:anchor>
+        </w:drawing>
+      </w:r>
+    </w:p>
+    <w:p>
+      <w:pPr>
+        <w:pStyle w:val="Heading2"/>
+      </w:pPr>
+      <w:bookmarkStart w:id="9" w:name="_Toc229527515"/>
+      <w:r>
+        <w:lastRenderedPageBreak/>
+        <w:t>Posts Routes</w:t>
+      </w:r>
+      <w:bookmarkEnd w:id="9"/>
+    </w:p>
+    <w:p>
+      <w:r>
+        <w:rPr>
+          <w:b/>
+          <w:bCs/>
+        </w:rPr>
+        <w:t>Create Post</w:t>
+      </w:r>
+    </w:p>
+    <w:p>
+      <w:pPr>
+        <w:numPr>
+          <w:ilvl w:val="0"/>
+          <w:numId w:val="28"/>
+        </w:numPr>
+      </w:pPr>
+      <w:r>
+        <w:t>POST http://localhost:5001/api/posts/createpost</w:t>
+      </w:r>
+    </w:p>
+    <w:p>
+      <w:r>
+        <w:rPr>
+          <w:noProof/>
+        </w:rPr>
+        <w:drawing>
+          <wp:anchor distT="0" distB="0" distL="114300" distR="114300" simplePos="0" relativeHeight="251663360" behindDoc="0" locked="0" layoutInCell="1" allowOverlap="1" wp14:anchorId="77661819" wp14:editId="7017A4AA">
+            <wp:simplePos x="0" y="0"/>
+            <wp:positionH relativeFrom="margin">
+              <wp:align>center</wp:align>
+            </wp:positionH>
+            <wp:positionV relativeFrom="paragraph">
+              <wp:posOffset>269875</wp:posOffset>
+            </wp:positionV>
+            <wp:extent cx="6309360" cy="5120640"/>
+            <wp:effectExtent l="0" t="0" r="0" b="3810"/>
+            <wp:wrapTopAndBottom/>
+            <wp:docPr id="1918776761" name="Picture 7"/>
+            <wp:cNvGraphicFramePr>
+              <a:graphicFrameLocks xmlns:a="http://schemas.openxmlformats.org/drawingml/2006/main" noChangeAspect="1"/>
+            </wp:cNvGraphicFramePr>
+            <a:graphic xmlns:a="http://schemas.openxmlformats.org/drawingml/2006/main">
+              <a:graphicData uri="http://schemas.openxmlformats.org/drawingml/2006/picture">
+                <pic:pic xmlns:pic="http://schemas.openxmlformats.org/drawingml/2006/picture">
+                  <pic:nvPicPr>
+                    <pic:cNvPr id="1918776761" name="Picture 1918776761"/>
+                    <pic:cNvPicPr/>
+                  </pic:nvPicPr>
+                  <pic:blipFill>
+                    <a:blip r:embed="rId24">
+                      <a:extLst>
+                        <a:ext uri="{28A0092B-C50C-407E-A947-70E740481C1C}">
+                          <a14:useLocalDpi xmlns:a14="http://schemas.microsoft.com/office/drawing/2010/main" val="0"/>
+                        </a:ext>
+                      </a:extLst>
+                    </a:blip>
+                    <a:stretch>
+                      <a:fillRect/>
+                    </a:stretch>
+                  </pic:blipFill>
+                  <pic:spPr>
+                    <a:xfrm>
+                      <a:off x="0" y="0"/>
+                      <a:ext cx="6309360" cy="5120640"/>
+                    </a:xfrm>
+                    <a:prstGeom prst="rect">
+                      <a:avLst/>
+                    </a:prstGeom>
+                  </pic:spPr>
+                </pic:pic>
+              </a:graphicData>
+            </a:graphic>
+          </wp:anchor>
+        </w:drawing>
+      </w:r>
+    </w:p>
+    <w:p/>
+    <w:p/>
+    <w:p/>
+    <w:p/>
+    <w:p/>
+    <w:p/>
+    <w:p/>
+    <w:p/>
+    <w:p/>
+    <w:p/>
+    <w:p/>
+    <w:p/>
+    <w:p/>
+    <w:p/>
+    <w:p/>
+    <w:p/>
+    <w:p/>
+    <w:p/>
+    <w:p>
+      <w:r>
+        <w:rPr>
+          <w:b/>
+          <w:bCs/>
+        </w:rPr>
+        <w:lastRenderedPageBreak/>
+        <w:t>Get Single Post</w:t>
+      </w:r>
+    </w:p>
+    <w:p>
+      <w:pPr>
+        <w:numPr>
+          <w:ilvl w:val="0"/>
+          <w:numId w:val="29"/>
+        </w:numPr>
+      </w:pPr>
+      <w:r>
+        <w:rPr>
+          <w:noProof/>
+        </w:rPr>
+        <w:drawing>
+          <wp:anchor distT="0" distB="0" distL="114300" distR="114300" simplePos="0" relativeHeight="251662336" behindDoc="0" locked="0" layoutInCell="1" allowOverlap="1" wp14:anchorId="77D990A4" wp14:editId="7DC45782">
+            <wp:simplePos x="0" y="0"/>
+            <wp:positionH relativeFrom="margin">
+              <wp:align>center</wp:align>
+            </wp:positionH>
+            <wp:positionV relativeFrom="paragraph">
+              <wp:posOffset>306705</wp:posOffset>
+            </wp:positionV>
+            <wp:extent cx="5455285" cy="5343525"/>
+            <wp:effectExtent l="0" t="0" r="0" b="9525"/>
+            <wp:wrapTopAndBottom/>
+            <wp:docPr id="1185466027" name="Picture 8"/>
+            <wp:cNvGraphicFramePr>
+              <a:graphicFrameLocks xmlns:a="http://schemas.openxmlformats.org/drawingml/2006/main" noChangeAspect="1"/>
+            </wp:cNvGraphicFramePr>
+            <a:graphic xmlns:a="http://schemas.openxmlformats.org/drawingml/2006/main">
+              <a:graphicData uri="http://schemas.openxmlformats.org/drawingml/2006/picture">
+                <pic:pic xmlns:pic="http://schemas.openxmlformats.org/drawingml/2006/picture">
+                  <pic:nvPicPr>
+                    <pic:cNvPr id="1185466027" name="Picture 1185466027"/>
+                    <pic:cNvPicPr/>
+                  </pic:nvPicPr>
+                  <pic:blipFill>
+                    <a:blip r:embed="rId25">
+                      <a:extLst>
+                        <a:ext uri="{28A0092B-C50C-407E-A947-70E740481C1C}">
+                          <a14:useLocalDpi xmlns:a14="http://schemas.microsoft.com/office/drawing/2010/main" val="0"/>
+                        </a:ext>
+                      </a:extLst>
+                    </a:blip>
+                    <a:stretch>
+                      <a:fillRect/>
+                    </a:stretch>
+                  </pic:blipFill>
+                  <pic:spPr>
+                    <a:xfrm>
+                      <a:off x="0" y="0"/>
+                      <a:ext cx="5455285" cy="5343525"/>
+                    </a:xfrm>
+                    <a:prstGeom prst="rect">
+                      <a:avLst/>
+                    </a:prstGeom>
+                  </pic:spPr>
+                </pic:pic>
+              </a:graphicData>
+            </a:graphic>
+            <wp14:sizeRelH relativeFrom="margin">
+              <wp14:pctWidth>0</wp14:pctWidth>
+            </wp14:sizeRelH>
+            <wp14:sizeRelV relativeFrom="margin">
+              <wp14:pctHeight>0</wp14:pctHeight>
+            </wp14:sizeRelV>
+          </wp:anchor>
+        </w:drawing>
+      </w:r>
+      <w:r>
+        <w:t>GET http://localhost:5001/api/posts/POST_ID</w:t>
+      </w:r>
+    </w:p>
+    <w:p/>
+    <w:p/>
+    <w:p/>
+    <w:p/>
+    <w:p/>
+    <w:p/>
+    <w:p/>
+    <w:p/>
+    <w:p/>
+    <w:p/>
+    <w:p/>
+    <w:p/>
+    <w:p/>
+    <w:p/>
+    <w:p/>
+    <w:p/>
+    <w:p/>
+    <w:p/>
+    <w:p/>
+    <w:p>
+      <w:pPr>
+        <w:pStyle w:val="Heading2"/>
+      </w:pPr>
+      <w:bookmarkStart w:id="10" w:name="_Toc229527516"/>
+      <w:r>
+        <w:lastRenderedPageBreak/>
+        <w:t>Votes Routes</w:t>
+      </w:r>
+      <w:bookmarkEnd w:id="10"/>
+    </w:p>
+    <w:p>
+      <w:r>
+        <w:rPr>
+          <w:b/>
+          <w:bCs/>
+        </w:rPr>
+        <w:t>Toggle Vote (upvote/downvote)</w:t>
+      </w:r>
+    </w:p>
+    <w:p>
+      <w:pPr>
+        <w:numPr>
+          <w:ilvl w:val="0"/>
+          <w:numId w:val="30"/>
+        </w:numPr>
+      </w:pPr>
+      <w:r>
+        <w:t>POST http://localhost:5001/api/votes/votes/POST_ID</w:t>
+      </w:r>
+    </w:p>
+    <w:p>
+      <w:r>
+        <w:rPr>
+          <w:noProof/>
+        </w:rPr>
+        <w:drawing>
+          <wp:inline distT="0" distB="0" distL="0" distR="0" wp14:anchorId="3286941D" wp14:editId="11C45716">
+            <wp:extent cx="5061857" cy="3910284"/>
+            <wp:effectExtent l="0" t="0" r="5715" b="0"/>
+            <wp:docPr id="1288696596" name="Picture 9"/>
+            <wp:cNvGraphicFramePr>
+              <a:graphicFrameLocks xmlns:a="http://schemas.openxmlformats.org/drawingml/2006/main" noChangeAspect="1"/>
+            </wp:cNvGraphicFramePr>
+            <a:graphic xmlns:a="http://schemas.openxmlformats.org/drawingml/2006/main">
+              <a:graphicData uri="http://schemas.openxmlformats.org/drawingml/2006/picture">
+                <pic:pic xmlns:pic="http://schemas.openxmlformats.org/drawingml/2006/picture">
+                  <pic:nvPicPr>
+                    <pic:cNvPr id="1288696596" name="Picture 1288696596"/>
+                    <pic:cNvPicPr/>
+                  </pic:nvPicPr>
+                  <pic:blipFill>
+                    <a:blip r:embed="rId26">
+                      <a:extLst>
+                        <a:ext uri="{28A0092B-C50C-407E-A947-70E740481C1C}">
+                          <a14:useLocalDpi xmlns:a14="http://schemas.microsoft.com/office/drawing/2010/main" val="0"/>
+                        </a:ext>
+                      </a:extLst>
+                    </a:blip>
+                    <a:stretch>
+                      <a:fillRect/>
+                    </a:stretch>
+                  </pic:blipFill>
+                  <pic:spPr>
+                    <a:xfrm>
+                      <a:off x="0" y="0"/>
+                      <a:ext cx="5076036" cy="3921238"/>
+                    </a:xfrm>
+                    <a:prstGeom prst="rect">
+                      <a:avLst/>
+                    </a:prstGeom>
+                  </pic:spPr>
+                </pic:pic>
+              </a:graphicData>
+            </a:graphic>
+          </wp:inline>
+        </w:drawing>
+      </w:r>
+    </w:p>
+    <w:p>
+      <w:r>
+        <w:rPr>
+          <w:b/>
+          <w:bCs/>
+        </w:rPr>
+        <w:t>Get Votes for Post</w:t>
+      </w:r>
+    </w:p>
+    <w:p>
+      <w:pPr>
+        <w:numPr>
+          <w:ilvl w:val="0"/>
+          <w:numId w:val="31"/>
+        </w:numPr>
+      </w:pPr>
+      <w:r>
+        <w:t>GET http://localhost:5001/api/votes/votes/POST_ID</w:t>
+      </w:r>
+    </w:p>
+    <w:p/>
+    <w:p>
+      <w:r>
+        <w:rPr>
+          <w:noProof/>
+        </w:rPr>
+        <w:drawing>
+          <wp:inline distT="0" distB="0" distL="0" distR="0" wp14:anchorId="1BFB783C" wp14:editId="50B19C8D">
+            <wp:extent cx="4985657" cy="4060540"/>
+            <wp:effectExtent l="0" t="0" r="5715" b="0"/>
+            <wp:docPr id="1476782531" name="Picture 10"/>
+            <wp:cNvGraphicFramePr>
+              <a:graphicFrameLocks xmlns:a="http://schemas.openxmlformats.org/drawingml/2006/main" noChangeAspect="1"/>
+            </wp:cNvGraphicFramePr>
+            <a:graphic xmlns:a="http://schemas.openxmlformats.org/drawingml/2006/main">
+              <a:graphicData uri="http://schemas.openxmlformats.org/drawingml/2006/picture">
+                <pic:pic xmlns:pic="http://schemas.openxmlformats.org/drawingml/2006/picture">
+                  <pic:nvPicPr>
+                    <pic:cNvPr id="1476782531" name="Picture 1476782531"/>
+                    <pic:cNvPicPr/>
+                  </pic:nvPicPr>
+                  <pic:blipFill>
+                    <a:blip r:embed="rId27">
+                      <a:extLst>
+                        <a:ext uri="{28A0092B-C50C-407E-A947-70E740481C1C}">
+                          <a14:useLocalDpi xmlns:a14="http://schemas.microsoft.com/office/drawing/2010/main" val="0"/>
+                        </a:ext>
+                      </a:extLst>
+                    </a:blip>
+                    <a:stretch>
+                      <a:fillRect/>
+                    </a:stretch>
+                  </pic:blipFill>
+                  <pic:spPr>
+                    <a:xfrm>
+                      <a:off x="0" y="0"/>
+                      <a:ext cx="5018553" cy="4087332"/>
+                    </a:xfrm>
+                    <a:prstGeom prst="rect">
+                      <a:avLst/>
+                    </a:prstGeom>
+                  </pic:spPr>
+                </pic:pic>
+              </a:graphicData>
+            </a:graphic>
+          </wp:inline>
+        </w:drawing>
+      </w:r>
+    </w:p>
+    <w:p/>
+    <w:p>
+      <w:pPr>
+        <w:pStyle w:val="Heading2"/>
+      </w:pPr>
+      <w:bookmarkStart w:id="11" w:name="_Toc229527517"/>
+      <w:r>
+        <w:t>Comments Routes</w:t>
+      </w:r>
+      <w:bookmarkEnd w:id="11"/>
+    </w:p>
+    <w:p>
+      <w:r>
+        <w:rPr>
+          <w:b/>
+          <w:bCs/>
+        </w:rPr>
+        <w:t>Create Comment</w:t>
+      </w:r>
+    </w:p>
+    <w:p>
+      <w:pPr>
+        <w:numPr>
+          <w:ilvl w:val="0"/>
+          <w:numId w:val="32"/>
+        </w:numPr>
+      </w:pPr>
+      <w:r>
+        <w:t>POST http://localhost:5001/api/comments/comments/POST_ID</w:t>
+      </w:r>
+    </w:p>
+    <w:p/>
+    <w:p>
+      <w:pPr>
+        <w:rPr>
+          <w:noProof/>
+        </w:rPr>
+      </w:pPr>
+      <w:r>
+        <w:rPr>
+          <w:noProof/>
+        </w:rPr>
+        <w:drawing>
+          <wp:anchor distT="0" distB="0" distL="114300" distR="114300" simplePos="0" relativeHeight="251664384" behindDoc="1" locked="0" layoutInCell="1" allowOverlap="1" wp14:anchorId="655A1BFC" wp14:editId="7E233FE9">
+            <wp:simplePos x="0" y="0"/>
+            <wp:positionH relativeFrom="margin">
+              <wp:align>center</wp:align>
+            </wp:positionH>
+            <wp:positionV relativeFrom="paragraph">
+              <wp:posOffset>30480</wp:posOffset>
+            </wp:positionV>
+            <wp:extent cx="4985836" cy="3653971"/>
+            <wp:effectExtent l="0" t="0" r="5715" b="3810"/>
+            <wp:wrapTight wrapText="bothSides">
+              <wp:wrapPolygon edited="0">
+                <wp:start x="0" y="0"/>
+                <wp:lineTo x="0" y="21510"/>
+                <wp:lineTo x="21542" y="21510"/>
+                <wp:lineTo x="21542" y="0"/>
+                <wp:lineTo x="0" y="0"/>
+              </wp:wrapPolygon>
+            </wp:wrapTight>
+            <wp:docPr id="1525433426" name="Picture 11"/>
+            <wp:cNvGraphicFramePr>
+              <a:graphicFrameLocks xmlns:a="http://schemas.openxmlformats.org/drawingml/2006/main" noChangeAspect="1"/>
+            </wp:cNvGraphicFramePr>
+            <a:graphic xmlns:a="http://schemas.openxmlformats.org/drawingml/2006/main">
+              <a:graphicData uri="http://schemas.openxmlformats.org/drawingml/2006/picture">
+                <pic:pic xmlns:pic="http://schemas.openxmlformats.org/drawingml/2006/picture">
+                  <pic:nvPicPr>
+                    <pic:cNvPr id="1525433426" name="Picture 1525433426"/>
+                    <pic:cNvPicPr/>
+                  </pic:nvPicPr>
+                  <pic:blipFill>
+                    <a:blip r:embed="rId28">
+                      <a:extLst>
+                        <a:ext uri="{28A0092B-C50C-407E-A947-70E740481C1C}">
+                          <a14:useLocalDpi xmlns:a14="http://schemas.microsoft.com/office/drawing/2010/main" val="0"/>
+                        </a:ext>
+                      </a:extLst>
+                    </a:blip>
+                    <a:stretch>
+                      <a:fillRect/>
+                    </a:stretch>
+                  </pic:blipFill>
+                  <pic:spPr>
+                    <a:xfrm>
+                      <a:off x="0" y="0"/>
+                      <a:ext cx="4985836" cy="3653971"/>
+                    </a:xfrm>
+                    <a:prstGeom prst="rect">
+                      <a:avLst/>
+                    </a:prstGeom>
+                  </pic:spPr>
+                </pic:pic>
+              </a:graphicData>
+            </a:graphic>
+          </wp:anchor>
+        </w:drawing>
+      </w:r>
+    </w:p>
+    <w:p/>
+    <w:p/>
+    <w:p/>
+    <w:p/>
+    <w:p/>
+    <w:p/>
+    <w:p/>
+    <w:p/>
+    <w:p/>
+    <w:p/>
+    <w:p/>
+    <w:p/>
+    <w:p/>
+    <w:p/>
+    <w:p/>
+    <w:p/>
+    <w:p/>
+    <w:p/>
+    <w:p/>
+    <w:p/>
+    <w:p/>
+    <w:p>
+      <w:r>
+        <w:rPr>
+          <w:b/>
+          <w:bCs/>
+        </w:rPr>
+        <w:t>Get Comments for Post</w:t>
+      </w:r>
+    </w:p>
+    <w:p>
+      <w:pPr>
+        <w:numPr>
+          <w:ilvl w:val="0"/>
+          <w:numId w:val="33"/>
+        </w:numPr>
+      </w:pPr>
+      <w:r>
+        <w:t>GET http://localhost:5001/api/comments/comments/POST_ID</w:t>
+      </w:r>
+    </w:p>
+    <w:p>
+      <w:pPr>
+        <w:jc w:val="center"/>
+      </w:pPr>
+      <w:r>
+        <w:rPr>
+          <w:noProof/>
+        </w:rPr>
+        <w:drawing>
+          <wp:anchor distT="0" distB="0" distL="114300" distR="114300" simplePos="0" relativeHeight="251665408" behindDoc="1" locked="0" layoutInCell="1" allowOverlap="1" wp14:anchorId="6360FD82" wp14:editId="5E59B944">
+            <wp:simplePos x="0" y="0"/>
+            <wp:positionH relativeFrom="margin">
+              <wp:posOffset>1165860</wp:posOffset>
+            </wp:positionH>
+            <wp:positionV relativeFrom="paragraph">
+              <wp:posOffset>44811</wp:posOffset>
+            </wp:positionV>
+            <wp:extent cx="4617720" cy="3953783"/>
+            <wp:effectExtent l="0" t="0" r="0" b="8890"/>
+            <wp:wrapTight wrapText="bothSides">
+              <wp:wrapPolygon edited="0">
+                <wp:start x="0" y="0"/>
+                <wp:lineTo x="0" y="21544"/>
+                <wp:lineTo x="21475" y="21544"/>
+                <wp:lineTo x="21475" y="0"/>
+                <wp:lineTo x="0" y="0"/>
+              </wp:wrapPolygon>
+            </wp:wrapTight>
+            <wp:docPr id="1930379660" name="Picture 12"/>
+            <wp:cNvGraphicFramePr>
+              <a:graphicFrameLocks xmlns:a="http://schemas.openxmlformats.org/drawingml/2006/main" noChangeAspect="1"/>
+            </wp:cNvGraphicFramePr>
+            <a:graphic xmlns:a="http://schemas.openxmlformats.org/drawingml/2006/main">
+              <a:graphicData uri="http://schemas.openxmlformats.org/drawingml/2006/picture">
+                <pic:pic xmlns:pic="http://schemas.openxmlformats.org/drawingml/2006/picture">
+                  <pic:nvPicPr>
+                    <pic:cNvPr id="1930379660" name="Picture 1930379660"/>
+                    <pic:cNvPicPr/>
+                  </pic:nvPicPr>
+                  <pic:blipFill>
+                    <a:blip r:embed="rId29">
+                      <a:extLst>
+                        <a:ext uri="{28A0092B-C50C-407E-A947-70E740481C1C}">
+                          <a14:useLocalDpi xmlns:a14="http://schemas.microsoft.com/office/drawing/2010/main" val="0"/>
+                        </a:ext>
+                      </a:extLst>
+                    </a:blip>
+                    <a:stretch>
+                      <a:fillRect/>
+                    </a:stretch>
+                  </pic:blipFill>
+                  <pic:spPr>
+                    <a:xfrm>
+                      <a:off x="0" y="0"/>
+                      <a:ext cx="4618039" cy="3954056"/>
+                    </a:xfrm>
+                    <a:prstGeom prst="rect">
+                      <a:avLst/>
+                    </a:prstGeom>
+                  </pic:spPr>
+                </pic:pic>
+              </a:graphicData>
+            </a:graphic>
+            <wp14:sizeRelH relativeFrom="margin">
+              <wp14:pctWidth>0</wp14:pctWidth>
+            </wp14:sizeRelH>
+            <wp14:sizeRelV relativeFrom="margin">
+              <wp14:pctHeight>0</wp14:pctHeight>
+            </wp14:sizeRelV>
+          </wp:anchor>
+        </w:drawing>
+      </w:r>
+    </w:p>
+    <w:p/>
+    <w:p/>
+    <w:p/>
+    <w:p/>
+    <w:p>
+      <w:r>
+        <w:t xml:space="preserve"> </w:t>
+      </w:r>
+    </w:p>
+    <w:p/>
+    <w:p/>
+    <w:p/>
+    <w:p/>
+    <w:p/>
+    <w:p/>
+    <w:p/>
+    <w:p/>
+    <w:p/>
+    <w:p/>
+    <w:p/>
+    <w:p/>
+    <w:p/>
+    <w:p/>
+    <w:p/>
+    <w:p/>
+    <w:p/>
+    <w:p/>
+    <w:p>
+      <w:pPr>
+        <w:pStyle w:val="Heading2"/>
+      </w:pPr>
+      <w:bookmarkStart w:id="12" w:name="_Toc229527518"/>
+      <w:r>
+        <w:t>Post Summary</w:t>
+      </w:r>
+      <w:bookmarkEnd w:id="12"/>
+      <w:r>
+        <w:t xml:space="preserve"> </w:t>
+      </w:r>
+    </w:p>
+    <w:p>
+      <w:r>
+        <w:rPr>
+          <w:b/>
+          <w:bCs/>
+        </w:rPr>
+        <w:t>Summarize Post</w:t>
+      </w:r>
+    </w:p>
+    <w:p>
+      <w:pPr>
+        <w:numPr>
+          <w:ilvl w:val="0"/>
+          <w:numId w:val="34"/>
+        </w:numPr>
+      </w:pPr>
+      <w:r>
+        <w:rPr>
+          <w:noProof/>
+        </w:rPr>
+        <w:drawing>
+          <wp:anchor distT="0" distB="0" distL="114300" distR="114300" simplePos="0" relativeHeight="251666432" behindDoc="1" locked="0" layoutInCell="1" allowOverlap="1" wp14:anchorId="579D9FA3" wp14:editId="19816AA9">
+            <wp:simplePos x="0" y="0"/>
+            <wp:positionH relativeFrom="margin">
+              <wp:align>right</wp:align>
+            </wp:positionH>
+            <wp:positionV relativeFrom="paragraph">
+              <wp:posOffset>723900</wp:posOffset>
+            </wp:positionV>
+            <wp:extent cx="6858000" cy="4853940"/>
+            <wp:effectExtent l="0" t="0" r="0" b="3810"/>
+            <wp:wrapTight wrapText="bothSides">
+              <wp:wrapPolygon edited="0">
+                <wp:start x="0" y="0"/>
+                <wp:lineTo x="0" y="21532"/>
+                <wp:lineTo x="21540" y="21532"/>
+                <wp:lineTo x="21540" y="0"/>
+                <wp:lineTo x="0" y="0"/>
+              </wp:wrapPolygon>
+            </wp:wrapTight>
+            <wp:docPr id="512978554" name="Picture 13"/>
+            <wp:cNvGraphicFramePr>
+              <a:graphicFrameLocks xmlns:a="http://schemas.openxmlformats.org/drawingml/2006/main" noChangeAspect="1"/>
+            </wp:cNvGraphicFramePr>
+            <a:graphic xmlns:a="http://schemas.openxmlformats.org/drawingml/2006/main">
+              <a:graphicData uri="http://schemas.openxmlformats.org/drawingml/2006/picture">
+                <pic:pic xmlns:pic="http://schemas.openxmlformats.org/drawingml/2006/picture">
+                  <pic:nvPicPr>
+                    <pic:cNvPr id="512978554" name="Picture 512978554"/>
+                    <pic:cNvPicPr/>
+                  </pic:nvPicPr>
+                  <pic:blipFill>
+                    <a:blip r:embed="rId30">
+                      <a:extLst>
+                        <a:ext uri="{28A0092B-C50C-407E-A947-70E740481C1C}">
+                          <a14:useLocalDpi xmlns:a14="http://schemas.microsoft.com/office/drawing/2010/main" val="0"/>
+                        </a:ext>
+                      </a:extLst>
+                    </a:blip>
+                    <a:stretch>
+                      <a:fillRect/>
+                    </a:stretch>
+                  </pic:blipFill>
+                  <pic:spPr>
+                    <a:xfrm>
+                      <a:off x="0" y="0"/>
+                      <a:ext cx="6858000" cy="4853940"/>
+                    </a:xfrm>
+                    <a:prstGeom prst="rect">
+                      <a:avLst/>
+                    </a:prstGeom>
+                  </pic:spPr>
+                </pic:pic>
+              </a:graphicData>
+            </a:graphic>
+          </wp:anchor>
+        </w:drawing>
+      </w:r>
+      <w:r>
+        <w:t>POST http://localhost:5001/api/postsummary/summary/POST_ID</w:t>
+      </w:r>
+    </w:p>
     <w:sectPr>
-      <w:headerReference w:type="even" r:id="rId18"/>
-      <w:headerReference w:type="default" r:id="rId19"/>
-      <w:footerReference w:type="default" r:id="rId20"/>
+      <w:headerReference w:type="even" r:id="rId31"/>
+      <w:headerReference w:type="default" r:id="rId32"/>
+      <w:footerReference w:type="default" r:id="rId33"/>
       <w:pgSz w:w="12240" w:h="15840" w:code="1"/>
       <w:pgMar w:top="720" w:right="720" w:bottom="720" w:left="720" w:header="289" w:footer="0" w:gutter="0"/>
       <w:cols w:space="708"/>
@@ -1555,6 +3321,155 @@
     </w:lvl>
   </w:abstractNum>
   <w:abstractNum w:abstractNumId="10" w15:restartNumberingAfterBreak="0">
+    <w:nsid w:val="032A1EC5"/>
+    <w:multiLevelType w:val="multilevel"/>
+    <w:tmpl w:val="66067632"/>
+    <w:lvl w:ilvl="0">
+      <w:start w:val="1"/>
+      <w:numFmt w:val="bullet"/>
+      <w:lvlText w:val=""/>
+      <w:lvlJc w:val="left"/>
+      <w:pPr>
+        <w:tabs>
+          <w:tab w:val="num" w:pos="720"/>
+        </w:tabs>
+        <w:ind w:left="720" w:hanging="360"/>
+      </w:pPr>
+      <w:rPr>
+        <w:rFonts w:ascii="Symbol" w:hAnsi="Symbol" w:hint="default"/>
+        <w:sz w:val="20"/>
+      </w:rPr>
+    </w:lvl>
+    <w:lvl w:ilvl="1" w:tentative="1">
+      <w:start w:val="1"/>
+      <w:numFmt w:val="bullet"/>
+      <w:lvlText w:val="o"/>
+      <w:lvlJc w:val="left"/>
+      <w:pPr>
+        <w:tabs>
+          <w:tab w:val="num" w:pos="1440"/>
+        </w:tabs>
+        <w:ind w:left="1440" w:hanging="360"/>
+      </w:pPr>
+      <w:rPr>
+        <w:rFonts w:ascii="Courier New" w:hAnsi="Courier New" w:hint="default"/>
+        <w:sz w:val="20"/>
+      </w:rPr>
+    </w:lvl>
+    <w:lvl w:ilvl="2" w:tentative="1">
+      <w:start w:val="1"/>
+      <w:numFmt w:val="bullet"/>
+      <w:lvlText w:val=""/>
+      <w:lvlJc w:val="left"/>
+      <w:pPr>
+        <w:tabs>
+          <w:tab w:val="num" w:pos="2160"/>
+        </w:tabs>
+        <w:ind w:left="2160" w:hanging="360"/>
+      </w:pPr>
+      <w:rPr>
+        <w:rFonts w:ascii="Wingdings" w:hAnsi="Wingdings" w:hint="default"/>
+        <w:sz w:val="20"/>
+      </w:rPr>
+    </w:lvl>
+    <w:lvl w:ilvl="3" w:tentative="1">
+      <w:start w:val="1"/>
+      <w:numFmt w:val="bullet"/>
+      <w:lvlText w:val=""/>
+      <w:lvlJc w:val="left"/>
+      <w:pPr>
+        <w:tabs>
+          <w:tab w:val="num" w:pos="2880"/>
+        </w:tabs>
+        <w:ind w:left="2880" w:hanging="360"/>
+      </w:pPr>
+      <w:rPr>
+        <w:rFonts w:ascii="Wingdings" w:hAnsi="Wingdings" w:hint="default"/>
+        <w:sz w:val="20"/>
+      </w:rPr>
+    </w:lvl>
+    <w:lvl w:ilvl="4" w:tentative="1">
+      <w:start w:val="1"/>
+      <w:numFmt w:val="bullet"/>
+      <w:lvlText w:val=""/>
+      <w:lvlJc w:val="left"/>
+      <w:pPr>
+        <w:tabs>
+          <w:tab w:val="num" w:pos="3600"/>
+        </w:tabs>
+        <w:ind w:left="3600" w:hanging="360"/>
+      </w:pPr>
+      <w:rPr>
+        <w:rFonts w:ascii="Wingdings" w:hAnsi="Wingdings" w:hint="default"/>
+        <w:sz w:val="20"/>
+      </w:rPr>
+    </w:lvl>
+    <w:lvl w:ilvl="5" w:tentative="1">
+      <w:start w:val="1"/>
+      <w:numFmt w:val="bullet"/>
+      <w:lvlText w:val=""/>
+      <w:lvlJc w:val="left"/>
+      <w:pPr>
+        <w:tabs>
+          <w:tab w:val="num" w:pos="4320"/>
+        </w:tabs>
+        <w:ind w:left="4320" w:hanging="360"/>
+      </w:pPr>
+      <w:rPr>
+        <w:rFonts w:ascii="Wingdings" w:hAnsi="Wingdings" w:hint="default"/>
+        <w:sz w:val="20"/>
+      </w:rPr>
+    </w:lvl>
+    <w:lvl w:ilvl="6" w:tentative="1">
+      <w:start w:val="1"/>
+      <w:numFmt w:val="bullet"/>
+      <w:lvlText w:val=""/>
+      <w:lvlJc w:val="left"/>
+      <w:pPr>
+        <w:tabs>
+          <w:tab w:val="num" w:pos="5040"/>
+        </w:tabs>
+        <w:ind w:left="5040" w:hanging="360"/>
+      </w:pPr>
+      <w:rPr>
+        <w:rFonts w:ascii="Wingdings" w:hAnsi="Wingdings" w:hint="default"/>
+        <w:sz w:val="20"/>
+      </w:rPr>
+    </w:lvl>
+    <w:lvl w:ilvl="7" w:tentative="1">
+      <w:start w:val="1"/>
+      <w:numFmt w:val="bullet"/>
+      <w:lvlText w:val=""/>
+      <w:lvlJc w:val="left"/>
+      <w:pPr>
+        <w:tabs>
+          <w:tab w:val="num" w:pos="5760"/>
+        </w:tabs>
+        <w:ind w:left="5760" w:hanging="360"/>
+      </w:pPr>
+      <w:rPr>
+        <w:rFonts w:ascii="Wingdings" w:hAnsi="Wingdings" w:hint="default"/>
+        <w:sz w:val="20"/>
+      </w:rPr>
+    </w:lvl>
+    <w:lvl w:ilvl="8" w:tentative="1">
+      <w:start w:val="1"/>
+      <w:numFmt w:val="bullet"/>
+      <w:lvlText w:val=""/>
+      <w:lvlJc w:val="left"/>
+      <w:pPr>
+        <w:tabs>
+          <w:tab w:val="num" w:pos="6480"/>
+        </w:tabs>
+        <w:ind w:left="6480" w:hanging="360"/>
+      </w:pPr>
+      <w:rPr>
+        <w:rFonts w:ascii="Wingdings" w:hAnsi="Wingdings" w:hint="default"/>
+        <w:sz w:val="20"/>
+      </w:rPr>
+    </w:lvl>
+  </w:abstractNum>
+  <w:abstractNum w:abstractNumId="11" w15:restartNumberingAfterBreak="0">
     <w:nsid w:val="09FF1C4B"/>
     <w:multiLevelType w:val="hybridMultilevel"/>
     <w:tmpl w:val="41DCE96C"/>
@@ -1667,7 +3582,7 @@
       </w:rPr>
     </w:lvl>
   </w:abstractNum>
-  <w:abstractNum w:abstractNumId="11" w15:restartNumberingAfterBreak="0">
+  <w:abstractNum w:abstractNumId="12" w15:restartNumberingAfterBreak="0">
     <w:nsid w:val="10983D53"/>
     <w:multiLevelType w:val="multilevel"/>
     <w:tmpl w:val="BBCCFDCC"/>
@@ -1816,7 +3731,156 @@
       </w:rPr>
     </w:lvl>
   </w:abstractNum>
-  <w:abstractNum w:abstractNumId="12" w15:restartNumberingAfterBreak="0">
+  <w:abstractNum w:abstractNumId="13" w15:restartNumberingAfterBreak="0">
+    <w:nsid w:val="11867787"/>
+    <w:multiLevelType w:val="multilevel"/>
+    <w:tmpl w:val="848C7738"/>
+    <w:lvl w:ilvl="0">
+      <w:start w:val="1"/>
+      <w:numFmt w:val="bullet"/>
+      <w:lvlText w:val=""/>
+      <w:lvlJc w:val="left"/>
+      <w:pPr>
+        <w:tabs>
+          <w:tab w:val="num" w:pos="720"/>
+        </w:tabs>
+        <w:ind w:left="720" w:hanging="360"/>
+      </w:pPr>
+      <w:rPr>
+        <w:rFonts w:ascii="Symbol" w:hAnsi="Symbol" w:hint="default"/>
+        <w:sz w:val="20"/>
+      </w:rPr>
+    </w:lvl>
+    <w:lvl w:ilvl="1" w:tentative="1">
+      <w:start w:val="1"/>
+      <w:numFmt w:val="bullet"/>
+      <w:lvlText w:val="o"/>
+      <w:lvlJc w:val="left"/>
+      <w:pPr>
+        <w:tabs>
+          <w:tab w:val="num" w:pos="1440"/>
+        </w:tabs>
+        <w:ind w:left="1440" w:hanging="360"/>
+      </w:pPr>
+      <w:rPr>
+        <w:rFonts w:ascii="Courier New" w:hAnsi="Courier New" w:hint="default"/>
+        <w:sz w:val="20"/>
+      </w:rPr>
+    </w:lvl>
+    <w:lvl w:ilvl="2" w:tentative="1">
+      <w:start w:val="1"/>
+      <w:numFmt w:val="bullet"/>
+      <w:lvlText w:val=""/>
+      <w:lvlJc w:val="left"/>
+      <w:pPr>
+        <w:tabs>
+          <w:tab w:val="num" w:pos="2160"/>
+        </w:tabs>
+        <w:ind w:left="2160" w:hanging="360"/>
+      </w:pPr>
+      <w:rPr>
+        <w:rFonts w:ascii="Wingdings" w:hAnsi="Wingdings" w:hint="default"/>
+        <w:sz w:val="20"/>
+      </w:rPr>
+    </w:lvl>
+    <w:lvl w:ilvl="3" w:tentative="1">
+      <w:start w:val="1"/>
+      <w:numFmt w:val="bullet"/>
+      <w:lvlText w:val=""/>
+      <w:lvlJc w:val="left"/>
+      <w:pPr>
+        <w:tabs>
+          <w:tab w:val="num" w:pos="2880"/>
+        </w:tabs>
+        <w:ind w:left="2880" w:hanging="360"/>
+      </w:pPr>
+      <w:rPr>
+        <w:rFonts w:ascii="Wingdings" w:hAnsi="Wingdings" w:hint="default"/>
+        <w:sz w:val="20"/>
+      </w:rPr>
+    </w:lvl>
+    <w:lvl w:ilvl="4" w:tentative="1">
+      <w:start w:val="1"/>
+      <w:numFmt w:val="bullet"/>
+      <w:lvlText w:val=""/>
+      <w:lvlJc w:val="left"/>
+      <w:pPr>
+        <w:tabs>
+          <w:tab w:val="num" w:pos="3600"/>
+        </w:tabs>
+        <w:ind w:left="3600" w:hanging="360"/>
+      </w:pPr>
+      <w:rPr>
+        <w:rFonts w:ascii="Wingdings" w:hAnsi="Wingdings" w:hint="default"/>
+        <w:sz w:val="20"/>
+      </w:rPr>
+    </w:lvl>
+    <w:lvl w:ilvl="5" w:tentative="1">
+      <w:start w:val="1"/>
+      <w:numFmt w:val="bullet"/>
+      <w:lvlText w:val=""/>
+      <w:lvlJc w:val="left"/>
+      <w:pPr>
+        <w:tabs>
+          <w:tab w:val="num" w:pos="4320"/>
+        </w:tabs>
+        <w:ind w:left="4320" w:hanging="360"/>
+      </w:pPr>
+      <w:rPr>
+        <w:rFonts w:ascii="Wingdings" w:hAnsi="Wingdings" w:hint="default"/>
+        <w:sz w:val="20"/>
+      </w:rPr>
+    </w:lvl>
+    <w:lvl w:ilvl="6" w:tentative="1">
+      <w:start w:val="1"/>
+      <w:numFmt w:val="bullet"/>
+      <w:lvlText w:val=""/>
+      <w:lvlJc w:val="left"/>
+      <w:pPr>
+        <w:tabs>
+          <w:tab w:val="num" w:pos="5040"/>
+        </w:tabs>
+        <w:ind w:left="5040" w:hanging="360"/>
+      </w:pPr>
+      <w:rPr>
+        <w:rFonts w:ascii="Wingdings" w:hAnsi="Wingdings" w:hint="default"/>
+        <w:sz w:val="20"/>
+      </w:rPr>
+    </w:lvl>
+    <w:lvl w:ilvl="7" w:tentative="1">
+      <w:start w:val="1"/>
+      <w:numFmt w:val="bullet"/>
+      <w:lvlText w:val=""/>
+      <w:lvlJc w:val="left"/>
+      <w:pPr>
+        <w:tabs>
+          <w:tab w:val="num" w:pos="5760"/>
+        </w:tabs>
+        <w:ind w:left="5760" w:hanging="360"/>
+      </w:pPr>
+      <w:rPr>
+        <w:rFonts w:ascii="Wingdings" w:hAnsi="Wingdings" w:hint="default"/>
+        <w:sz w:val="20"/>
+      </w:rPr>
+    </w:lvl>
+    <w:lvl w:ilvl="8" w:tentative="1">
+      <w:start w:val="1"/>
+      <w:numFmt w:val="bullet"/>
+      <w:lvlText w:val=""/>
+      <w:lvlJc w:val="left"/>
+      <w:pPr>
+        <w:tabs>
+          <w:tab w:val="num" w:pos="6480"/>
+        </w:tabs>
+        <w:ind w:left="6480" w:hanging="360"/>
+      </w:pPr>
+      <w:rPr>
+        <w:rFonts w:ascii="Wingdings" w:hAnsi="Wingdings" w:hint="default"/>
+        <w:sz w:val="20"/>
+      </w:rPr>
+    </w:lvl>
+  </w:abstractNum>
+  <w:abstractNum w:abstractNumId="14" w15:restartNumberingAfterBreak="0">
     <w:nsid w:val="23117996"/>
     <w:multiLevelType w:val="hybridMultilevel"/>
     <w:tmpl w:val="6526CF40"/>
@@ -1929,7 +3993,305 @@
       </w:rPr>
     </w:lvl>
   </w:abstractNum>
-  <w:abstractNum w:abstractNumId="13" w15:restartNumberingAfterBreak="0">
+  <w:abstractNum w:abstractNumId="15" w15:restartNumberingAfterBreak="0">
+    <w:nsid w:val="283409D6"/>
+    <w:multiLevelType w:val="multilevel"/>
+    <w:tmpl w:val="EA405320"/>
+    <w:lvl w:ilvl="0">
+      <w:start w:val="1"/>
+      <w:numFmt w:val="bullet"/>
+      <w:lvlText w:val=""/>
+      <w:lvlJc w:val="left"/>
+      <w:pPr>
+        <w:tabs>
+          <w:tab w:val="num" w:pos="720"/>
+        </w:tabs>
+        <w:ind w:left="720" w:hanging="360"/>
+      </w:pPr>
+      <w:rPr>
+        <w:rFonts w:ascii="Symbol" w:hAnsi="Symbol" w:hint="default"/>
+        <w:sz w:val="20"/>
+      </w:rPr>
+    </w:lvl>
+    <w:lvl w:ilvl="1" w:tentative="1">
+      <w:start w:val="1"/>
+      <w:numFmt w:val="bullet"/>
+      <w:lvlText w:val="o"/>
+      <w:lvlJc w:val="left"/>
+      <w:pPr>
+        <w:tabs>
+          <w:tab w:val="num" w:pos="1440"/>
+        </w:tabs>
+        <w:ind w:left="1440" w:hanging="360"/>
+      </w:pPr>
+      <w:rPr>
+        <w:rFonts w:ascii="Courier New" w:hAnsi="Courier New" w:hint="default"/>
+        <w:sz w:val="20"/>
+      </w:rPr>
+    </w:lvl>
+    <w:lvl w:ilvl="2" w:tentative="1">
+      <w:start w:val="1"/>
+      <w:numFmt w:val="bullet"/>
+      <w:lvlText w:val=""/>
+      <w:lvlJc w:val="left"/>
+      <w:pPr>
+        <w:tabs>
+          <w:tab w:val="num" w:pos="2160"/>
+        </w:tabs>
+        <w:ind w:left="2160" w:hanging="360"/>
+      </w:pPr>
+      <w:rPr>
+        <w:rFonts w:ascii="Wingdings" w:hAnsi="Wingdings" w:hint="default"/>
+        <w:sz w:val="20"/>
+      </w:rPr>
+    </w:lvl>
+    <w:lvl w:ilvl="3" w:tentative="1">
+      <w:start w:val="1"/>
+      <w:numFmt w:val="bullet"/>
+      <w:lvlText w:val=""/>
+      <w:lvlJc w:val="left"/>
+      <w:pPr>
+        <w:tabs>
+          <w:tab w:val="num" w:pos="2880"/>
+        </w:tabs>
+        <w:ind w:left="2880" w:hanging="360"/>
+      </w:pPr>
+      <w:rPr>
+        <w:rFonts w:ascii="Wingdings" w:hAnsi="Wingdings" w:hint="default"/>
+        <w:sz w:val="20"/>
+      </w:rPr>
+    </w:lvl>
+    <w:lvl w:ilvl="4" w:tentative="1">
+      <w:start w:val="1"/>
+      <w:numFmt w:val="bullet"/>
+      <w:lvlText w:val=""/>
+      <w:lvlJc w:val="left"/>
+      <w:pPr>
+        <w:tabs>
+          <w:tab w:val="num" w:pos="3600"/>
+        </w:tabs>
+        <w:ind w:left="3600" w:hanging="360"/>
+      </w:pPr>
+      <w:rPr>
+        <w:rFonts w:ascii="Wingdings" w:hAnsi="Wingdings" w:hint="default"/>
+        <w:sz w:val="20"/>
+      </w:rPr>
+    </w:lvl>
+    <w:lvl w:ilvl="5" w:tentative="1">
+      <w:start w:val="1"/>
+      <w:numFmt w:val="bullet"/>
+      <w:lvlText w:val=""/>
+      <w:lvlJc w:val="left"/>
+      <w:pPr>
+        <w:tabs>
+          <w:tab w:val="num" w:pos="4320"/>
+        </w:tabs>
+        <w:ind w:left="4320" w:hanging="360"/>
+      </w:pPr>
+      <w:rPr>
+        <w:rFonts w:ascii="Wingdings" w:hAnsi="Wingdings" w:hint="default"/>
+        <w:sz w:val="20"/>
+      </w:rPr>
+    </w:lvl>
+    <w:lvl w:ilvl="6" w:tentative="1">
+      <w:start w:val="1"/>
+      <w:numFmt w:val="bullet"/>
+      <w:lvlText w:val=""/>
+      <w:lvlJc w:val="left"/>
+      <w:pPr>
+        <w:tabs>
+          <w:tab w:val="num" w:pos="5040"/>
+        </w:tabs>
+        <w:ind w:left="5040" w:hanging="360"/>
+      </w:pPr>
+      <w:rPr>
+        <w:rFonts w:ascii="Wingdings" w:hAnsi="Wingdings" w:hint="default"/>
+        <w:sz w:val="20"/>
+      </w:rPr>
+    </w:lvl>
+    <w:lvl w:ilvl="7" w:tentative="1">
+      <w:start w:val="1"/>
+      <w:numFmt w:val="bullet"/>
+      <w:lvlText w:val=""/>
+      <w:lvlJc w:val="left"/>
+      <w:pPr>
+        <w:tabs>
+          <w:tab w:val="num" w:pos="5760"/>
+        </w:tabs>
+        <w:ind w:left="5760" w:hanging="360"/>
+      </w:pPr>
+      <w:rPr>
+        <w:rFonts w:ascii="Wingdings" w:hAnsi="Wingdings" w:hint="default"/>
+        <w:sz w:val="20"/>
+      </w:rPr>
+    </w:lvl>
+    <w:lvl w:ilvl="8" w:tentative="1">
+      <w:start w:val="1"/>
+      <w:numFmt w:val="bullet"/>
+      <w:lvlText w:val=""/>
+      <w:lvlJc w:val="left"/>
+      <w:pPr>
+        <w:tabs>
+          <w:tab w:val="num" w:pos="6480"/>
+        </w:tabs>
+        <w:ind w:left="6480" w:hanging="360"/>
+      </w:pPr>
+      <w:rPr>
+        <w:rFonts w:ascii="Wingdings" w:hAnsi="Wingdings" w:hint="default"/>
+        <w:sz w:val="20"/>
+      </w:rPr>
+    </w:lvl>
+  </w:abstractNum>
+  <w:abstractNum w:abstractNumId="16" w15:restartNumberingAfterBreak="0">
+    <w:nsid w:val="2A412F3F"/>
+    <w:multiLevelType w:val="multilevel"/>
+    <w:tmpl w:val="5D063CF2"/>
+    <w:lvl w:ilvl="0">
+      <w:start w:val="1"/>
+      <w:numFmt w:val="bullet"/>
+      <w:lvlText w:val=""/>
+      <w:lvlJc w:val="left"/>
+      <w:pPr>
+        <w:tabs>
+          <w:tab w:val="num" w:pos="720"/>
+        </w:tabs>
+        <w:ind w:left="720" w:hanging="360"/>
+      </w:pPr>
+      <w:rPr>
+        <w:rFonts w:ascii="Symbol" w:hAnsi="Symbol" w:hint="default"/>
+        <w:sz w:val="20"/>
+      </w:rPr>
+    </w:lvl>
+    <w:lvl w:ilvl="1" w:tentative="1">
+      <w:start w:val="1"/>
+      <w:numFmt w:val="bullet"/>
+      <w:lvlText w:val="o"/>
+      <w:lvlJc w:val="left"/>
+      <w:pPr>
+        <w:tabs>
+          <w:tab w:val="num" w:pos="1440"/>
+        </w:tabs>
+        <w:ind w:left="1440" w:hanging="360"/>
+      </w:pPr>
+      <w:rPr>
+        <w:rFonts w:ascii="Courier New" w:hAnsi="Courier New" w:hint="default"/>
+        <w:sz w:val="20"/>
+      </w:rPr>
+    </w:lvl>
+    <w:lvl w:ilvl="2" w:tentative="1">
+      <w:start w:val="1"/>
+      <w:numFmt w:val="bullet"/>
+      <w:lvlText w:val=""/>
+      <w:lvlJc w:val="left"/>
+      <w:pPr>
+        <w:tabs>
+          <w:tab w:val="num" w:pos="2160"/>
+        </w:tabs>
+        <w:ind w:left="2160" w:hanging="360"/>
+      </w:pPr>
+      <w:rPr>
+        <w:rFonts w:ascii="Wingdings" w:hAnsi="Wingdings" w:hint="default"/>
+        <w:sz w:val="20"/>
+      </w:rPr>
+    </w:lvl>
+    <w:lvl w:ilvl="3" w:tentative="1">
+      <w:start w:val="1"/>
+      <w:numFmt w:val="bullet"/>
+      <w:lvlText w:val=""/>
+      <w:lvlJc w:val="left"/>
+      <w:pPr>
+        <w:tabs>
+          <w:tab w:val="num" w:pos="2880"/>
+        </w:tabs>
+        <w:ind w:left="2880" w:hanging="360"/>
+      </w:pPr>
+      <w:rPr>
+        <w:rFonts w:ascii="Wingdings" w:hAnsi="Wingdings" w:hint="default"/>
+        <w:sz w:val="20"/>
+      </w:rPr>
+    </w:lvl>
+    <w:lvl w:ilvl="4" w:tentative="1">
+      <w:start w:val="1"/>
+      <w:numFmt w:val="bullet"/>
+      <w:lvlText w:val=""/>
+      <w:lvlJc w:val="left"/>
+      <w:pPr>
+        <w:tabs>
+          <w:tab w:val="num" w:pos="3600"/>
+        </w:tabs>
+        <w:ind w:left="3600" w:hanging="360"/>
+      </w:pPr>
+      <w:rPr>
+        <w:rFonts w:ascii="Wingdings" w:hAnsi="Wingdings" w:hint="default"/>
+        <w:sz w:val="20"/>
+      </w:rPr>
+    </w:lvl>
+    <w:lvl w:ilvl="5" w:tentative="1">
+      <w:start w:val="1"/>
+      <w:numFmt w:val="bullet"/>
+      <w:lvlText w:val=""/>
+      <w:lvlJc w:val="left"/>
+      <w:pPr>
+        <w:tabs>
+          <w:tab w:val="num" w:pos="4320"/>
+        </w:tabs>
+        <w:ind w:left="4320" w:hanging="360"/>
+      </w:pPr>
+      <w:rPr>
+        <w:rFonts w:ascii="Wingdings" w:hAnsi="Wingdings" w:hint="default"/>
+        <w:sz w:val="20"/>
+      </w:rPr>
+    </w:lvl>
+    <w:lvl w:ilvl="6" w:tentative="1">
+      <w:start w:val="1"/>
+      <w:numFmt w:val="bullet"/>
+      <w:lvlText w:val=""/>
+      <w:lvlJc w:val="left"/>
+      <w:pPr>
+        <w:tabs>
+          <w:tab w:val="num" w:pos="5040"/>
+        </w:tabs>
+        <w:ind w:left="5040" w:hanging="360"/>
+      </w:pPr>
+      <w:rPr>
+        <w:rFonts w:ascii="Wingdings" w:hAnsi="Wingdings" w:hint="default"/>
+        <w:sz w:val="20"/>
+      </w:rPr>
+    </w:lvl>
+    <w:lvl w:ilvl="7" w:tentative="1">
+      <w:start w:val="1"/>
+      <w:numFmt w:val="bullet"/>
+      <w:lvlText w:val=""/>
+      <w:lvlJc w:val="left"/>
+      <w:pPr>
+        <w:tabs>
+          <w:tab w:val="num" w:pos="5760"/>
+        </w:tabs>
+        <w:ind w:left="5760" w:hanging="360"/>
+      </w:pPr>
+      <w:rPr>
+        <w:rFonts w:ascii="Wingdings" w:hAnsi="Wingdings" w:hint="default"/>
+        <w:sz w:val="20"/>
+      </w:rPr>
+    </w:lvl>
+    <w:lvl w:ilvl="8" w:tentative="1">
+      <w:start w:val="1"/>
+      <w:numFmt w:val="bullet"/>
+      <w:lvlText w:val=""/>
+      <w:lvlJc w:val="left"/>
+      <w:pPr>
+        <w:tabs>
+          <w:tab w:val="num" w:pos="6480"/>
+        </w:tabs>
+        <w:ind w:left="6480" w:hanging="360"/>
+      </w:pPr>
+      <w:rPr>
+        <w:rFonts w:ascii="Wingdings" w:hAnsi="Wingdings" w:hint="default"/>
+        <w:sz w:val="20"/>
+      </w:rPr>
+    </w:lvl>
+  </w:abstractNum>
+  <w:abstractNum w:abstractNumId="17" w15:restartNumberingAfterBreak="0">
     <w:nsid w:val="2ACF074A"/>
     <w:multiLevelType w:val="hybridMultilevel"/>
     <w:tmpl w:val="8D1CE7A4"/>
@@ -2042,7 +4404,156 @@
       </w:rPr>
     </w:lvl>
   </w:abstractNum>
-  <w:abstractNum w:abstractNumId="14" w15:restartNumberingAfterBreak="0">
+  <w:abstractNum w:abstractNumId="18" w15:restartNumberingAfterBreak="0">
+    <w:nsid w:val="2D107D08"/>
+    <w:multiLevelType w:val="multilevel"/>
+    <w:tmpl w:val="EB7A4902"/>
+    <w:lvl w:ilvl="0">
+      <w:start w:val="1"/>
+      <w:numFmt w:val="bullet"/>
+      <w:lvlText w:val=""/>
+      <w:lvlJc w:val="left"/>
+      <w:pPr>
+        <w:tabs>
+          <w:tab w:val="num" w:pos="720"/>
+        </w:tabs>
+        <w:ind w:left="720" w:hanging="360"/>
+      </w:pPr>
+      <w:rPr>
+        <w:rFonts w:ascii="Symbol" w:hAnsi="Symbol" w:hint="default"/>
+        <w:sz w:val="20"/>
+      </w:rPr>
+    </w:lvl>
+    <w:lvl w:ilvl="1" w:tentative="1">
+      <w:start w:val="1"/>
+      <w:numFmt w:val="bullet"/>
+      <w:lvlText w:val="o"/>
+      <w:lvlJc w:val="left"/>
+      <w:pPr>
+        <w:tabs>
+          <w:tab w:val="num" w:pos="1440"/>
+        </w:tabs>
+        <w:ind w:left="1440" w:hanging="360"/>
+      </w:pPr>
+      <w:rPr>
+        <w:rFonts w:ascii="Courier New" w:hAnsi="Courier New" w:hint="default"/>
+        <w:sz w:val="20"/>
+      </w:rPr>
+    </w:lvl>
+    <w:lvl w:ilvl="2" w:tentative="1">
+      <w:start w:val="1"/>
+      <w:numFmt w:val="bullet"/>
+      <w:lvlText w:val=""/>
+      <w:lvlJc w:val="left"/>
+      <w:pPr>
+        <w:tabs>
+          <w:tab w:val="num" w:pos="2160"/>
+        </w:tabs>
+        <w:ind w:left="2160" w:hanging="360"/>
+      </w:pPr>
+      <w:rPr>
+        <w:rFonts w:ascii="Wingdings" w:hAnsi="Wingdings" w:hint="default"/>
+        <w:sz w:val="20"/>
+      </w:rPr>
+    </w:lvl>
+    <w:lvl w:ilvl="3" w:tentative="1">
+      <w:start w:val="1"/>
+      <w:numFmt w:val="bullet"/>
+      <w:lvlText w:val=""/>
+      <w:lvlJc w:val="left"/>
+      <w:pPr>
+        <w:tabs>
+          <w:tab w:val="num" w:pos="2880"/>
+        </w:tabs>
+        <w:ind w:left="2880" w:hanging="360"/>
+      </w:pPr>
+      <w:rPr>
+        <w:rFonts w:ascii="Wingdings" w:hAnsi="Wingdings" w:hint="default"/>
+        <w:sz w:val="20"/>
+      </w:rPr>
+    </w:lvl>
+    <w:lvl w:ilvl="4" w:tentative="1">
+      <w:start w:val="1"/>
+      <w:numFmt w:val="bullet"/>
+      <w:lvlText w:val=""/>
+      <w:lvlJc w:val="left"/>
+      <w:pPr>
+        <w:tabs>
+          <w:tab w:val="num" w:pos="3600"/>
+        </w:tabs>
+        <w:ind w:left="3600" w:hanging="360"/>
+      </w:pPr>
+      <w:rPr>
+        <w:rFonts w:ascii="Wingdings" w:hAnsi="Wingdings" w:hint="default"/>
+        <w:sz w:val="20"/>
+      </w:rPr>
+    </w:lvl>
+    <w:lvl w:ilvl="5" w:tentative="1">
+      <w:start w:val="1"/>
+      <w:numFmt w:val="bullet"/>
+      <w:lvlText w:val=""/>
+      <w:lvlJc w:val="left"/>
+      <w:pPr>
+        <w:tabs>
+          <w:tab w:val="num" w:pos="4320"/>
+        </w:tabs>
+        <w:ind w:left="4320" w:hanging="360"/>
+      </w:pPr>
+      <w:rPr>
+        <w:rFonts w:ascii="Wingdings" w:hAnsi="Wingdings" w:hint="default"/>
+        <w:sz w:val="20"/>
+      </w:rPr>
+    </w:lvl>
+    <w:lvl w:ilvl="6" w:tentative="1">
+      <w:start w:val="1"/>
+      <w:numFmt w:val="bullet"/>
+      <w:lvlText w:val=""/>
+      <w:lvlJc w:val="left"/>
+      <w:pPr>
+        <w:tabs>
+          <w:tab w:val="num" w:pos="5040"/>
+        </w:tabs>
+        <w:ind w:left="5040" w:hanging="360"/>
+      </w:pPr>
+      <w:rPr>
+        <w:rFonts w:ascii="Wingdings" w:hAnsi="Wingdings" w:hint="default"/>
+        <w:sz w:val="20"/>
+      </w:rPr>
+    </w:lvl>
+    <w:lvl w:ilvl="7" w:tentative="1">
+      <w:start w:val="1"/>
+      <w:numFmt w:val="bullet"/>
+      <w:lvlText w:val=""/>
+      <w:lvlJc w:val="left"/>
+      <w:pPr>
+        <w:tabs>
+          <w:tab w:val="num" w:pos="5760"/>
+        </w:tabs>
+        <w:ind w:left="5760" w:hanging="360"/>
+      </w:pPr>
+      <w:rPr>
+        <w:rFonts w:ascii="Wingdings" w:hAnsi="Wingdings" w:hint="default"/>
+        <w:sz w:val="20"/>
+      </w:rPr>
+    </w:lvl>
+    <w:lvl w:ilvl="8" w:tentative="1">
+      <w:start w:val="1"/>
+      <w:numFmt w:val="bullet"/>
+      <w:lvlText w:val=""/>
+      <w:lvlJc w:val="left"/>
+      <w:pPr>
+        <w:tabs>
+          <w:tab w:val="num" w:pos="6480"/>
+        </w:tabs>
+        <w:ind w:left="6480" w:hanging="360"/>
+      </w:pPr>
+      <w:rPr>
+        <w:rFonts w:ascii="Wingdings" w:hAnsi="Wingdings" w:hint="default"/>
+        <w:sz w:val="20"/>
+      </w:rPr>
+    </w:lvl>
+  </w:abstractNum>
+  <w:abstractNum w:abstractNumId="19" w15:restartNumberingAfterBreak="0">
     <w:nsid w:val="2D456C05"/>
     <w:multiLevelType w:val="multilevel"/>
     <w:tmpl w:val="95D6B2AC"/>
@@ -2191,7 +4702,305 @@
       </w:rPr>
     </w:lvl>
   </w:abstractNum>
-  <w:abstractNum w:abstractNumId="15" w15:restartNumberingAfterBreak="0">
+  <w:abstractNum w:abstractNumId="20" w15:restartNumberingAfterBreak="0">
+    <w:nsid w:val="2ED54B79"/>
+    <w:multiLevelType w:val="multilevel"/>
+    <w:tmpl w:val="25988D5A"/>
+    <w:lvl w:ilvl="0">
+      <w:start w:val="1"/>
+      <w:numFmt w:val="bullet"/>
+      <w:lvlText w:val=""/>
+      <w:lvlJc w:val="left"/>
+      <w:pPr>
+        <w:tabs>
+          <w:tab w:val="num" w:pos="720"/>
+        </w:tabs>
+        <w:ind w:left="720" w:hanging="360"/>
+      </w:pPr>
+      <w:rPr>
+        <w:rFonts w:ascii="Symbol" w:hAnsi="Symbol" w:hint="default"/>
+        <w:sz w:val="20"/>
+      </w:rPr>
+    </w:lvl>
+    <w:lvl w:ilvl="1" w:tentative="1">
+      <w:start w:val="1"/>
+      <w:numFmt w:val="bullet"/>
+      <w:lvlText w:val="o"/>
+      <w:lvlJc w:val="left"/>
+      <w:pPr>
+        <w:tabs>
+          <w:tab w:val="num" w:pos="1440"/>
+        </w:tabs>
+        <w:ind w:left="1440" w:hanging="360"/>
+      </w:pPr>
+      <w:rPr>
+        <w:rFonts w:ascii="Courier New" w:hAnsi="Courier New" w:hint="default"/>
+        <w:sz w:val="20"/>
+      </w:rPr>
+    </w:lvl>
+    <w:lvl w:ilvl="2" w:tentative="1">
+      <w:start w:val="1"/>
+      <w:numFmt w:val="bullet"/>
+      <w:lvlText w:val=""/>
+      <w:lvlJc w:val="left"/>
+      <w:pPr>
+        <w:tabs>
+          <w:tab w:val="num" w:pos="2160"/>
+        </w:tabs>
+        <w:ind w:left="2160" w:hanging="360"/>
+      </w:pPr>
+      <w:rPr>
+        <w:rFonts w:ascii="Wingdings" w:hAnsi="Wingdings" w:hint="default"/>
+        <w:sz w:val="20"/>
+      </w:rPr>
+    </w:lvl>
+    <w:lvl w:ilvl="3" w:tentative="1">
+      <w:start w:val="1"/>
+      <w:numFmt w:val="bullet"/>
+      <w:lvlText w:val=""/>
+      <w:lvlJc w:val="left"/>
+      <w:pPr>
+        <w:tabs>
+          <w:tab w:val="num" w:pos="2880"/>
+        </w:tabs>
+        <w:ind w:left="2880" w:hanging="360"/>
+      </w:pPr>
+      <w:rPr>
+        <w:rFonts w:ascii="Wingdings" w:hAnsi="Wingdings" w:hint="default"/>
+        <w:sz w:val="20"/>
+      </w:rPr>
+    </w:lvl>
+    <w:lvl w:ilvl="4" w:tentative="1">
+      <w:start w:val="1"/>
+      <w:numFmt w:val="bullet"/>
+      <w:lvlText w:val=""/>
+      <w:lvlJc w:val="left"/>
+      <w:pPr>
+        <w:tabs>
+          <w:tab w:val="num" w:pos="3600"/>
+        </w:tabs>
+        <w:ind w:left="3600" w:hanging="360"/>
+      </w:pPr>
+      <w:rPr>
+        <w:rFonts w:ascii="Wingdings" w:hAnsi="Wingdings" w:hint="default"/>
+        <w:sz w:val="20"/>
+      </w:rPr>
+    </w:lvl>
+    <w:lvl w:ilvl="5" w:tentative="1">
+      <w:start w:val="1"/>
+      <w:numFmt w:val="bullet"/>
+      <w:lvlText w:val=""/>
+      <w:lvlJc w:val="left"/>
+      <w:pPr>
+        <w:tabs>
+          <w:tab w:val="num" w:pos="4320"/>
+        </w:tabs>
+        <w:ind w:left="4320" w:hanging="360"/>
+      </w:pPr>
+      <w:rPr>
+        <w:rFonts w:ascii="Wingdings" w:hAnsi="Wingdings" w:hint="default"/>
+        <w:sz w:val="20"/>
+      </w:rPr>
+    </w:lvl>
+    <w:lvl w:ilvl="6" w:tentative="1">
+      <w:start w:val="1"/>
+      <w:numFmt w:val="bullet"/>
+      <w:lvlText w:val=""/>
+      <w:lvlJc w:val="left"/>
+      <w:pPr>
+        <w:tabs>
+          <w:tab w:val="num" w:pos="5040"/>
+        </w:tabs>
+        <w:ind w:left="5040" w:hanging="360"/>
+      </w:pPr>
+      <w:rPr>
+        <w:rFonts w:ascii="Wingdings" w:hAnsi="Wingdings" w:hint="default"/>
+        <w:sz w:val="20"/>
+      </w:rPr>
+    </w:lvl>
+    <w:lvl w:ilvl="7" w:tentative="1">
+      <w:start w:val="1"/>
+      <w:numFmt w:val="bullet"/>
+      <w:lvlText w:val=""/>
+      <w:lvlJc w:val="left"/>
+      <w:pPr>
+        <w:tabs>
+          <w:tab w:val="num" w:pos="5760"/>
+        </w:tabs>
+        <w:ind w:left="5760" w:hanging="360"/>
+      </w:pPr>
+      <w:rPr>
+        <w:rFonts w:ascii="Wingdings" w:hAnsi="Wingdings" w:hint="default"/>
+        <w:sz w:val="20"/>
+      </w:rPr>
+    </w:lvl>
+    <w:lvl w:ilvl="8" w:tentative="1">
+      <w:start w:val="1"/>
+      <w:numFmt w:val="bullet"/>
+      <w:lvlText w:val=""/>
+      <w:lvlJc w:val="left"/>
+      <w:pPr>
+        <w:tabs>
+          <w:tab w:val="num" w:pos="6480"/>
+        </w:tabs>
+        <w:ind w:left="6480" w:hanging="360"/>
+      </w:pPr>
+      <w:rPr>
+        <w:rFonts w:ascii="Wingdings" w:hAnsi="Wingdings" w:hint="default"/>
+        <w:sz w:val="20"/>
+      </w:rPr>
+    </w:lvl>
+  </w:abstractNum>
+  <w:abstractNum w:abstractNumId="21" w15:restartNumberingAfterBreak="0">
+    <w:nsid w:val="32017E5C"/>
+    <w:multiLevelType w:val="multilevel"/>
+    <w:tmpl w:val="E83AB34C"/>
+    <w:lvl w:ilvl="0">
+      <w:start w:val="1"/>
+      <w:numFmt w:val="bullet"/>
+      <w:lvlText w:val=""/>
+      <w:lvlJc w:val="left"/>
+      <w:pPr>
+        <w:tabs>
+          <w:tab w:val="num" w:pos="720"/>
+        </w:tabs>
+        <w:ind w:left="720" w:hanging="360"/>
+      </w:pPr>
+      <w:rPr>
+        <w:rFonts w:ascii="Symbol" w:hAnsi="Symbol" w:hint="default"/>
+        <w:sz w:val="20"/>
+      </w:rPr>
+    </w:lvl>
+    <w:lvl w:ilvl="1" w:tentative="1">
+      <w:start w:val="1"/>
+      <w:numFmt w:val="bullet"/>
+      <w:lvlText w:val="o"/>
+      <w:lvlJc w:val="left"/>
+      <w:pPr>
+        <w:tabs>
+          <w:tab w:val="num" w:pos="1440"/>
+        </w:tabs>
+        <w:ind w:left="1440" w:hanging="360"/>
+      </w:pPr>
+      <w:rPr>
+        <w:rFonts w:ascii="Courier New" w:hAnsi="Courier New" w:hint="default"/>
+        <w:sz w:val="20"/>
+      </w:rPr>
+    </w:lvl>
+    <w:lvl w:ilvl="2" w:tentative="1">
+      <w:start w:val="1"/>
+      <w:numFmt w:val="bullet"/>
+      <w:lvlText w:val=""/>
+      <w:lvlJc w:val="left"/>
+      <w:pPr>
+        <w:tabs>
+          <w:tab w:val="num" w:pos="2160"/>
+        </w:tabs>
+        <w:ind w:left="2160" w:hanging="360"/>
+      </w:pPr>
+      <w:rPr>
+        <w:rFonts w:ascii="Wingdings" w:hAnsi="Wingdings" w:hint="default"/>
+        <w:sz w:val="20"/>
+      </w:rPr>
+    </w:lvl>
+    <w:lvl w:ilvl="3" w:tentative="1">
+      <w:start w:val="1"/>
+      <w:numFmt w:val="bullet"/>
+      <w:lvlText w:val=""/>
+      <w:lvlJc w:val="left"/>
+      <w:pPr>
+        <w:tabs>
+          <w:tab w:val="num" w:pos="2880"/>
+        </w:tabs>
+        <w:ind w:left="2880" w:hanging="360"/>
+      </w:pPr>
+      <w:rPr>
+        <w:rFonts w:ascii="Wingdings" w:hAnsi="Wingdings" w:hint="default"/>
+        <w:sz w:val="20"/>
+      </w:rPr>
+    </w:lvl>
+    <w:lvl w:ilvl="4" w:tentative="1">
+      <w:start w:val="1"/>
+      <w:numFmt w:val="bullet"/>
+      <w:lvlText w:val=""/>
+      <w:lvlJc w:val="left"/>
+      <w:pPr>
+        <w:tabs>
+          <w:tab w:val="num" w:pos="3600"/>
+        </w:tabs>
+        <w:ind w:left="3600" w:hanging="360"/>
+      </w:pPr>
+      <w:rPr>
+        <w:rFonts w:ascii="Wingdings" w:hAnsi="Wingdings" w:hint="default"/>
+        <w:sz w:val="20"/>
+      </w:rPr>
+    </w:lvl>
+    <w:lvl w:ilvl="5" w:tentative="1">
+      <w:start w:val="1"/>
+      <w:numFmt w:val="bullet"/>
+      <w:lvlText w:val=""/>
+      <w:lvlJc w:val="left"/>
+      <w:pPr>
+        <w:tabs>
+          <w:tab w:val="num" w:pos="4320"/>
+        </w:tabs>
+        <w:ind w:left="4320" w:hanging="360"/>
+      </w:pPr>
+      <w:rPr>
+        <w:rFonts w:ascii="Wingdings" w:hAnsi="Wingdings" w:hint="default"/>
+        <w:sz w:val="20"/>
+      </w:rPr>
+    </w:lvl>
+    <w:lvl w:ilvl="6" w:tentative="1">
+      <w:start w:val="1"/>
+      <w:numFmt w:val="bullet"/>
+      <w:lvlText w:val=""/>
+      <w:lvlJc w:val="left"/>
+      <w:pPr>
+        <w:tabs>
+          <w:tab w:val="num" w:pos="5040"/>
+        </w:tabs>
+        <w:ind w:left="5040" w:hanging="360"/>
+      </w:pPr>
+      <w:rPr>
+        <w:rFonts w:ascii="Wingdings" w:hAnsi="Wingdings" w:hint="default"/>
+        <w:sz w:val="20"/>
+      </w:rPr>
+    </w:lvl>
+    <w:lvl w:ilvl="7" w:tentative="1">
+      <w:start w:val="1"/>
+      <w:numFmt w:val="bullet"/>
+      <w:lvlText w:val=""/>
+      <w:lvlJc w:val="left"/>
+      <w:pPr>
+        <w:tabs>
+          <w:tab w:val="num" w:pos="5760"/>
+        </w:tabs>
+        <w:ind w:left="5760" w:hanging="360"/>
+      </w:pPr>
+      <w:rPr>
+        <w:rFonts w:ascii="Wingdings" w:hAnsi="Wingdings" w:hint="default"/>
+        <w:sz w:val="20"/>
+      </w:rPr>
+    </w:lvl>
+    <w:lvl w:ilvl="8" w:tentative="1">
+      <w:start w:val="1"/>
+      <w:numFmt w:val="bullet"/>
+      <w:lvlText w:val=""/>
+      <w:lvlJc w:val="left"/>
+      <w:pPr>
+        <w:tabs>
+          <w:tab w:val="num" w:pos="6480"/>
+        </w:tabs>
+        <w:ind w:left="6480" w:hanging="360"/>
+      </w:pPr>
+      <w:rPr>
+        <w:rFonts w:ascii="Wingdings" w:hAnsi="Wingdings" w:hint="default"/>
+        <w:sz w:val="20"/>
+      </w:rPr>
+    </w:lvl>
+  </w:abstractNum>
+  <w:abstractNum w:abstractNumId="22" w15:restartNumberingAfterBreak="0">
     <w:nsid w:val="40111DB6"/>
     <w:multiLevelType w:val="hybridMultilevel"/>
     <w:tmpl w:val="FF54F306"/>
@@ -2304,7 +5113,305 @@
       </w:rPr>
     </w:lvl>
   </w:abstractNum>
-  <w:abstractNum w:abstractNumId="16" w15:restartNumberingAfterBreak="0">
+  <w:abstractNum w:abstractNumId="23" w15:restartNumberingAfterBreak="0">
+    <w:nsid w:val="41E357C1"/>
+    <w:multiLevelType w:val="multilevel"/>
+    <w:tmpl w:val="BA18B512"/>
+    <w:lvl w:ilvl="0">
+      <w:start w:val="1"/>
+      <w:numFmt w:val="bullet"/>
+      <w:lvlText w:val=""/>
+      <w:lvlJc w:val="left"/>
+      <w:pPr>
+        <w:tabs>
+          <w:tab w:val="num" w:pos="720"/>
+        </w:tabs>
+        <w:ind w:left="720" w:hanging="360"/>
+      </w:pPr>
+      <w:rPr>
+        <w:rFonts w:ascii="Symbol" w:hAnsi="Symbol" w:hint="default"/>
+        <w:sz w:val="20"/>
+      </w:rPr>
+    </w:lvl>
+    <w:lvl w:ilvl="1" w:tentative="1">
+      <w:start w:val="1"/>
+      <w:numFmt w:val="bullet"/>
+      <w:lvlText w:val="o"/>
+      <w:lvlJc w:val="left"/>
+      <w:pPr>
+        <w:tabs>
+          <w:tab w:val="num" w:pos="1440"/>
+        </w:tabs>
+        <w:ind w:left="1440" w:hanging="360"/>
+      </w:pPr>
+      <w:rPr>
+        <w:rFonts w:ascii="Courier New" w:hAnsi="Courier New" w:hint="default"/>
+        <w:sz w:val="20"/>
+      </w:rPr>
+    </w:lvl>
+    <w:lvl w:ilvl="2" w:tentative="1">
+      <w:start w:val="1"/>
+      <w:numFmt w:val="bullet"/>
+      <w:lvlText w:val=""/>
+      <w:lvlJc w:val="left"/>
+      <w:pPr>
+        <w:tabs>
+          <w:tab w:val="num" w:pos="2160"/>
+        </w:tabs>
+        <w:ind w:left="2160" w:hanging="360"/>
+      </w:pPr>
+      <w:rPr>
+        <w:rFonts w:ascii="Wingdings" w:hAnsi="Wingdings" w:hint="default"/>
+        <w:sz w:val="20"/>
+      </w:rPr>
+    </w:lvl>
+    <w:lvl w:ilvl="3" w:tentative="1">
+      <w:start w:val="1"/>
+      <w:numFmt w:val="bullet"/>
+      <w:lvlText w:val=""/>
+      <w:lvlJc w:val="left"/>
+      <w:pPr>
+        <w:tabs>
+          <w:tab w:val="num" w:pos="2880"/>
+        </w:tabs>
+        <w:ind w:left="2880" w:hanging="360"/>
+      </w:pPr>
+      <w:rPr>
+        <w:rFonts w:ascii="Wingdings" w:hAnsi="Wingdings" w:hint="default"/>
+        <w:sz w:val="20"/>
+      </w:rPr>
+    </w:lvl>
+    <w:lvl w:ilvl="4" w:tentative="1">
+      <w:start w:val="1"/>
+      <w:numFmt w:val="bullet"/>
+      <w:lvlText w:val=""/>
+      <w:lvlJc w:val="left"/>
+      <w:pPr>
+        <w:tabs>
+          <w:tab w:val="num" w:pos="3600"/>
+        </w:tabs>
+        <w:ind w:left="3600" w:hanging="360"/>
+      </w:pPr>
+      <w:rPr>
+        <w:rFonts w:ascii="Wingdings" w:hAnsi="Wingdings" w:hint="default"/>
+        <w:sz w:val="20"/>
+      </w:rPr>
+    </w:lvl>
+    <w:lvl w:ilvl="5" w:tentative="1">
+      <w:start w:val="1"/>
+      <w:numFmt w:val="bullet"/>
+      <w:lvlText w:val=""/>
+      <w:lvlJc w:val="left"/>
+      <w:pPr>
+        <w:tabs>
+          <w:tab w:val="num" w:pos="4320"/>
+        </w:tabs>
+        <w:ind w:left="4320" w:hanging="360"/>
+      </w:pPr>
+      <w:rPr>
+        <w:rFonts w:ascii="Wingdings" w:hAnsi="Wingdings" w:hint="default"/>
+        <w:sz w:val="20"/>
+      </w:rPr>
+    </w:lvl>
+    <w:lvl w:ilvl="6" w:tentative="1">
+      <w:start w:val="1"/>
+      <w:numFmt w:val="bullet"/>
+      <w:lvlText w:val=""/>
+      <w:lvlJc w:val="left"/>
+      <w:pPr>
+        <w:tabs>
+          <w:tab w:val="num" w:pos="5040"/>
+        </w:tabs>
+        <w:ind w:left="5040" w:hanging="360"/>
+      </w:pPr>
+      <w:rPr>
+        <w:rFonts w:ascii="Wingdings" w:hAnsi="Wingdings" w:hint="default"/>
+        <w:sz w:val="20"/>
+      </w:rPr>
+    </w:lvl>
+    <w:lvl w:ilvl="7" w:tentative="1">
+      <w:start w:val="1"/>
+      <w:numFmt w:val="bullet"/>
+      <w:lvlText w:val=""/>
+      <w:lvlJc w:val="left"/>
+      <w:pPr>
+        <w:tabs>
+          <w:tab w:val="num" w:pos="5760"/>
+        </w:tabs>
+        <w:ind w:left="5760" w:hanging="360"/>
+      </w:pPr>
+      <w:rPr>
+        <w:rFonts w:ascii="Wingdings" w:hAnsi="Wingdings" w:hint="default"/>
+        <w:sz w:val="20"/>
+      </w:rPr>
+    </w:lvl>
+    <w:lvl w:ilvl="8" w:tentative="1">
+      <w:start w:val="1"/>
+      <w:numFmt w:val="bullet"/>
+      <w:lvlText w:val=""/>
+      <w:lvlJc w:val="left"/>
+      <w:pPr>
+        <w:tabs>
+          <w:tab w:val="num" w:pos="6480"/>
+        </w:tabs>
+        <w:ind w:left="6480" w:hanging="360"/>
+      </w:pPr>
+      <w:rPr>
+        <w:rFonts w:ascii="Wingdings" w:hAnsi="Wingdings" w:hint="default"/>
+        <w:sz w:val="20"/>
+      </w:rPr>
+    </w:lvl>
+  </w:abstractNum>
+  <w:abstractNum w:abstractNumId="24" w15:restartNumberingAfterBreak="0">
+    <w:nsid w:val="50BB6022"/>
+    <w:multiLevelType w:val="multilevel"/>
+    <w:tmpl w:val="A1106D3A"/>
+    <w:lvl w:ilvl="0">
+      <w:start w:val="1"/>
+      <w:numFmt w:val="bullet"/>
+      <w:lvlText w:val=""/>
+      <w:lvlJc w:val="left"/>
+      <w:pPr>
+        <w:tabs>
+          <w:tab w:val="num" w:pos="720"/>
+        </w:tabs>
+        <w:ind w:left="720" w:hanging="360"/>
+      </w:pPr>
+      <w:rPr>
+        <w:rFonts w:ascii="Symbol" w:hAnsi="Symbol" w:hint="default"/>
+        <w:sz w:val="20"/>
+      </w:rPr>
+    </w:lvl>
+    <w:lvl w:ilvl="1" w:tentative="1">
+      <w:start w:val="1"/>
+      <w:numFmt w:val="bullet"/>
+      <w:lvlText w:val="o"/>
+      <w:lvlJc w:val="left"/>
+      <w:pPr>
+        <w:tabs>
+          <w:tab w:val="num" w:pos="1440"/>
+        </w:tabs>
+        <w:ind w:left="1440" w:hanging="360"/>
+      </w:pPr>
+      <w:rPr>
+        <w:rFonts w:ascii="Courier New" w:hAnsi="Courier New" w:hint="default"/>
+        <w:sz w:val="20"/>
+      </w:rPr>
+    </w:lvl>
+    <w:lvl w:ilvl="2" w:tentative="1">
+      <w:start w:val="1"/>
+      <w:numFmt w:val="bullet"/>
+      <w:lvlText w:val=""/>
+      <w:lvlJc w:val="left"/>
+      <w:pPr>
+        <w:tabs>
+          <w:tab w:val="num" w:pos="2160"/>
+        </w:tabs>
+        <w:ind w:left="2160" w:hanging="360"/>
+      </w:pPr>
+      <w:rPr>
+        <w:rFonts w:ascii="Wingdings" w:hAnsi="Wingdings" w:hint="default"/>
+        <w:sz w:val="20"/>
+      </w:rPr>
+    </w:lvl>
+    <w:lvl w:ilvl="3" w:tentative="1">
+      <w:start w:val="1"/>
+      <w:numFmt w:val="bullet"/>
+      <w:lvlText w:val=""/>
+      <w:lvlJc w:val="left"/>
+      <w:pPr>
+        <w:tabs>
+          <w:tab w:val="num" w:pos="2880"/>
+        </w:tabs>
+        <w:ind w:left="2880" w:hanging="360"/>
+      </w:pPr>
+      <w:rPr>
+        <w:rFonts w:ascii="Wingdings" w:hAnsi="Wingdings" w:hint="default"/>
+        <w:sz w:val="20"/>
+      </w:rPr>
+    </w:lvl>
+    <w:lvl w:ilvl="4" w:tentative="1">
+      <w:start w:val="1"/>
+      <w:numFmt w:val="bullet"/>
+      <w:lvlText w:val=""/>
+      <w:lvlJc w:val="left"/>
+      <w:pPr>
+        <w:tabs>
+          <w:tab w:val="num" w:pos="3600"/>
+        </w:tabs>
+        <w:ind w:left="3600" w:hanging="360"/>
+      </w:pPr>
+      <w:rPr>
+        <w:rFonts w:ascii="Wingdings" w:hAnsi="Wingdings" w:hint="default"/>
+        <w:sz w:val="20"/>
+      </w:rPr>
+    </w:lvl>
+    <w:lvl w:ilvl="5" w:tentative="1">
+      <w:start w:val="1"/>
+      <w:numFmt w:val="bullet"/>
+      <w:lvlText w:val=""/>
+      <w:lvlJc w:val="left"/>
+      <w:pPr>
+        <w:tabs>
+          <w:tab w:val="num" w:pos="4320"/>
+        </w:tabs>
+        <w:ind w:left="4320" w:hanging="360"/>
+      </w:pPr>
+      <w:rPr>
+        <w:rFonts w:ascii="Wingdings" w:hAnsi="Wingdings" w:hint="default"/>
+        <w:sz w:val="20"/>
+      </w:rPr>
+    </w:lvl>
+    <w:lvl w:ilvl="6" w:tentative="1">
+      <w:start w:val="1"/>
+      <w:numFmt w:val="bullet"/>
+      <w:lvlText w:val=""/>
+      <w:lvlJc w:val="left"/>
+      <w:pPr>
+        <w:tabs>
+          <w:tab w:val="num" w:pos="5040"/>
+        </w:tabs>
+        <w:ind w:left="5040" w:hanging="360"/>
+      </w:pPr>
+      <w:rPr>
+        <w:rFonts w:ascii="Wingdings" w:hAnsi="Wingdings" w:hint="default"/>
+        <w:sz w:val="20"/>
+      </w:rPr>
+    </w:lvl>
+    <w:lvl w:ilvl="7" w:tentative="1">
+      <w:start w:val="1"/>
+      <w:numFmt w:val="bullet"/>
+      <w:lvlText w:val=""/>
+      <w:lvlJc w:val="left"/>
+      <w:pPr>
+        <w:tabs>
+          <w:tab w:val="num" w:pos="5760"/>
+        </w:tabs>
+        <w:ind w:left="5760" w:hanging="360"/>
+      </w:pPr>
+      <w:rPr>
+        <w:rFonts w:ascii="Wingdings" w:hAnsi="Wingdings" w:hint="default"/>
+        <w:sz w:val="20"/>
+      </w:rPr>
+    </w:lvl>
+    <w:lvl w:ilvl="8" w:tentative="1">
+      <w:start w:val="1"/>
+      <w:numFmt w:val="bullet"/>
+      <w:lvlText w:val=""/>
+      <w:lvlJc w:val="left"/>
+      <w:pPr>
+        <w:tabs>
+          <w:tab w:val="num" w:pos="6480"/>
+        </w:tabs>
+        <w:ind w:left="6480" w:hanging="360"/>
+      </w:pPr>
+      <w:rPr>
+        <w:rFonts w:ascii="Wingdings" w:hAnsi="Wingdings" w:hint="default"/>
+        <w:sz w:val="20"/>
+      </w:rPr>
+    </w:lvl>
+  </w:abstractNum>
+  <w:abstractNum w:abstractNumId="25" w15:restartNumberingAfterBreak="0">
     <w:nsid w:val="59A12CEB"/>
     <w:multiLevelType w:val="hybridMultilevel"/>
     <w:tmpl w:val="C6F2B950"/>
@@ -2417,7 +5524,7 @@
       </w:rPr>
     </w:lvl>
   </w:abstractNum>
-  <w:abstractNum w:abstractNumId="17" w15:restartNumberingAfterBreak="0">
+  <w:abstractNum w:abstractNumId="26" w15:restartNumberingAfterBreak="0">
     <w:nsid w:val="5FC8492B"/>
     <w:multiLevelType w:val="multilevel"/>
     <w:tmpl w:val="E6CE0B1C"/>
@@ -2567,7 +5674,454 @@
       </w:rPr>
     </w:lvl>
   </w:abstractNum>
-  <w:abstractNum w:abstractNumId="18" w15:restartNumberingAfterBreak="0">
+  <w:abstractNum w:abstractNumId="27" w15:restartNumberingAfterBreak="0">
+    <w:nsid w:val="610422EA"/>
+    <w:multiLevelType w:val="multilevel"/>
+    <w:tmpl w:val="34FAED46"/>
+    <w:lvl w:ilvl="0">
+      <w:start w:val="1"/>
+      <w:numFmt w:val="bullet"/>
+      <w:lvlText w:val=""/>
+      <w:lvlJc w:val="left"/>
+      <w:pPr>
+        <w:tabs>
+          <w:tab w:val="num" w:pos="720"/>
+        </w:tabs>
+        <w:ind w:left="720" w:hanging="360"/>
+      </w:pPr>
+      <w:rPr>
+        <w:rFonts w:ascii="Symbol" w:hAnsi="Symbol" w:hint="default"/>
+        <w:sz w:val="20"/>
+      </w:rPr>
+    </w:lvl>
+    <w:lvl w:ilvl="1" w:tentative="1">
+      <w:start w:val="1"/>
+      <w:numFmt w:val="bullet"/>
+      <w:lvlText w:val="o"/>
+      <w:lvlJc w:val="left"/>
+      <w:pPr>
+        <w:tabs>
+          <w:tab w:val="num" w:pos="1440"/>
+        </w:tabs>
+        <w:ind w:left="1440" w:hanging="360"/>
+      </w:pPr>
+      <w:rPr>
+        <w:rFonts w:ascii="Courier New" w:hAnsi="Courier New" w:hint="default"/>
+        <w:sz w:val="20"/>
+      </w:rPr>
+    </w:lvl>
+    <w:lvl w:ilvl="2" w:tentative="1">
+      <w:start w:val="1"/>
+      <w:numFmt w:val="bullet"/>
+      <w:lvlText w:val=""/>
+      <w:lvlJc w:val="left"/>
+      <w:pPr>
+        <w:tabs>
+          <w:tab w:val="num" w:pos="2160"/>
+        </w:tabs>
+        <w:ind w:left="2160" w:hanging="360"/>
+      </w:pPr>
+      <w:rPr>
+        <w:rFonts w:ascii="Wingdings" w:hAnsi="Wingdings" w:hint="default"/>
+        <w:sz w:val="20"/>
+      </w:rPr>
+    </w:lvl>
+    <w:lvl w:ilvl="3" w:tentative="1">
+      <w:start w:val="1"/>
+      <w:numFmt w:val="bullet"/>
+      <w:lvlText w:val=""/>
+      <w:lvlJc w:val="left"/>
+      <w:pPr>
+        <w:tabs>
+          <w:tab w:val="num" w:pos="2880"/>
+        </w:tabs>
+        <w:ind w:left="2880" w:hanging="360"/>
+      </w:pPr>
+      <w:rPr>
+        <w:rFonts w:ascii="Wingdings" w:hAnsi="Wingdings" w:hint="default"/>
+        <w:sz w:val="20"/>
+      </w:rPr>
+    </w:lvl>
+    <w:lvl w:ilvl="4" w:tentative="1">
+      <w:start w:val="1"/>
+      <w:numFmt w:val="bullet"/>
+      <w:lvlText w:val=""/>
+      <w:lvlJc w:val="left"/>
+      <w:pPr>
+        <w:tabs>
+          <w:tab w:val="num" w:pos="3600"/>
+        </w:tabs>
+        <w:ind w:left="3600" w:hanging="360"/>
+      </w:pPr>
+      <w:rPr>
+        <w:rFonts w:ascii="Wingdings" w:hAnsi="Wingdings" w:hint="default"/>
+        <w:sz w:val="20"/>
+      </w:rPr>
+    </w:lvl>
+    <w:lvl w:ilvl="5" w:tentative="1">
+      <w:start w:val="1"/>
+      <w:numFmt w:val="bullet"/>
+      <w:lvlText w:val=""/>
+      <w:lvlJc w:val="left"/>
+      <w:pPr>
+        <w:tabs>
+          <w:tab w:val="num" w:pos="4320"/>
+        </w:tabs>
+        <w:ind w:left="4320" w:hanging="360"/>
+      </w:pPr>
+      <w:rPr>
+        <w:rFonts w:ascii="Wingdings" w:hAnsi="Wingdings" w:hint="default"/>
+        <w:sz w:val="20"/>
+      </w:rPr>
+    </w:lvl>
+    <w:lvl w:ilvl="6" w:tentative="1">
+      <w:start w:val="1"/>
+      <w:numFmt w:val="bullet"/>
+      <w:lvlText w:val=""/>
+      <w:lvlJc w:val="left"/>
+      <w:pPr>
+        <w:tabs>
+          <w:tab w:val="num" w:pos="5040"/>
+        </w:tabs>
+        <w:ind w:left="5040" w:hanging="360"/>
+      </w:pPr>
+      <w:rPr>
+        <w:rFonts w:ascii="Wingdings" w:hAnsi="Wingdings" w:hint="default"/>
+        <w:sz w:val="20"/>
+      </w:rPr>
+    </w:lvl>
+    <w:lvl w:ilvl="7" w:tentative="1">
+      <w:start w:val="1"/>
+      <w:numFmt w:val="bullet"/>
+      <w:lvlText w:val=""/>
+      <w:lvlJc w:val="left"/>
+      <w:pPr>
+        <w:tabs>
+          <w:tab w:val="num" w:pos="5760"/>
+        </w:tabs>
+        <w:ind w:left="5760" w:hanging="360"/>
+      </w:pPr>
+      <w:rPr>
+        <w:rFonts w:ascii="Wingdings" w:hAnsi="Wingdings" w:hint="default"/>
+        <w:sz w:val="20"/>
+      </w:rPr>
+    </w:lvl>
+    <w:lvl w:ilvl="8" w:tentative="1">
+      <w:start w:val="1"/>
+      <w:numFmt w:val="bullet"/>
+      <w:lvlText w:val=""/>
+      <w:lvlJc w:val="left"/>
+      <w:pPr>
+        <w:tabs>
+          <w:tab w:val="num" w:pos="6480"/>
+        </w:tabs>
+        <w:ind w:left="6480" w:hanging="360"/>
+      </w:pPr>
+      <w:rPr>
+        <w:rFonts w:ascii="Wingdings" w:hAnsi="Wingdings" w:hint="default"/>
+        <w:sz w:val="20"/>
+      </w:rPr>
+    </w:lvl>
+  </w:abstractNum>
+  <w:abstractNum w:abstractNumId="28" w15:restartNumberingAfterBreak="0">
+    <w:nsid w:val="65E8373C"/>
+    <w:multiLevelType w:val="multilevel"/>
+    <w:tmpl w:val="69020DF4"/>
+    <w:lvl w:ilvl="0">
+      <w:start w:val="1"/>
+      <w:numFmt w:val="bullet"/>
+      <w:lvlText w:val=""/>
+      <w:lvlJc w:val="left"/>
+      <w:pPr>
+        <w:tabs>
+          <w:tab w:val="num" w:pos="720"/>
+        </w:tabs>
+        <w:ind w:left="720" w:hanging="360"/>
+      </w:pPr>
+      <w:rPr>
+        <w:rFonts w:ascii="Symbol" w:hAnsi="Symbol" w:hint="default"/>
+        <w:sz w:val="20"/>
+      </w:rPr>
+    </w:lvl>
+    <w:lvl w:ilvl="1" w:tentative="1">
+      <w:start w:val="1"/>
+      <w:numFmt w:val="bullet"/>
+      <w:lvlText w:val="o"/>
+      <w:lvlJc w:val="left"/>
+      <w:pPr>
+        <w:tabs>
+          <w:tab w:val="num" w:pos="1440"/>
+        </w:tabs>
+        <w:ind w:left="1440" w:hanging="360"/>
+      </w:pPr>
+      <w:rPr>
+        <w:rFonts w:ascii="Courier New" w:hAnsi="Courier New" w:hint="default"/>
+        <w:sz w:val="20"/>
+      </w:rPr>
+    </w:lvl>
+    <w:lvl w:ilvl="2" w:tentative="1">
+      <w:start w:val="1"/>
+      <w:numFmt w:val="bullet"/>
+      <w:lvlText w:val=""/>
+      <w:lvlJc w:val="left"/>
+      <w:pPr>
+        <w:tabs>
+          <w:tab w:val="num" w:pos="2160"/>
+        </w:tabs>
+        <w:ind w:left="2160" w:hanging="360"/>
+      </w:pPr>
+      <w:rPr>
+        <w:rFonts w:ascii="Wingdings" w:hAnsi="Wingdings" w:hint="default"/>
+        <w:sz w:val="20"/>
+      </w:rPr>
+    </w:lvl>
+    <w:lvl w:ilvl="3" w:tentative="1">
+      <w:start w:val="1"/>
+      <w:numFmt w:val="bullet"/>
+      <w:lvlText w:val=""/>
+      <w:lvlJc w:val="left"/>
+      <w:pPr>
+        <w:tabs>
+          <w:tab w:val="num" w:pos="2880"/>
+        </w:tabs>
+        <w:ind w:left="2880" w:hanging="360"/>
+      </w:pPr>
+      <w:rPr>
+        <w:rFonts w:ascii="Wingdings" w:hAnsi="Wingdings" w:hint="default"/>
+        <w:sz w:val="20"/>
+      </w:rPr>
+    </w:lvl>
+    <w:lvl w:ilvl="4" w:tentative="1">
+      <w:start w:val="1"/>
+      <w:numFmt w:val="bullet"/>
+      <w:lvlText w:val=""/>
+      <w:lvlJc w:val="left"/>
+      <w:pPr>
+        <w:tabs>
+          <w:tab w:val="num" w:pos="3600"/>
+        </w:tabs>
+        <w:ind w:left="3600" w:hanging="360"/>
+      </w:pPr>
+      <w:rPr>
+        <w:rFonts w:ascii="Wingdings" w:hAnsi="Wingdings" w:hint="default"/>
+        <w:sz w:val="20"/>
+      </w:rPr>
+    </w:lvl>
+    <w:lvl w:ilvl="5" w:tentative="1">
+      <w:start w:val="1"/>
+      <w:numFmt w:val="bullet"/>
+      <w:lvlText w:val=""/>
+      <w:lvlJc w:val="left"/>
+      <w:pPr>
+        <w:tabs>
+          <w:tab w:val="num" w:pos="4320"/>
+        </w:tabs>
+        <w:ind w:left="4320" w:hanging="360"/>
+      </w:pPr>
+      <w:rPr>
+        <w:rFonts w:ascii="Wingdings" w:hAnsi="Wingdings" w:hint="default"/>
+        <w:sz w:val="20"/>
+      </w:rPr>
+    </w:lvl>
+    <w:lvl w:ilvl="6" w:tentative="1">
+      <w:start w:val="1"/>
+      <w:numFmt w:val="bullet"/>
+      <w:lvlText w:val=""/>
+      <w:lvlJc w:val="left"/>
+      <w:pPr>
+        <w:tabs>
+          <w:tab w:val="num" w:pos="5040"/>
+        </w:tabs>
+        <w:ind w:left="5040" w:hanging="360"/>
+      </w:pPr>
+      <w:rPr>
+        <w:rFonts w:ascii="Wingdings" w:hAnsi="Wingdings" w:hint="default"/>
+        <w:sz w:val="20"/>
+      </w:rPr>
+    </w:lvl>
+    <w:lvl w:ilvl="7" w:tentative="1">
+      <w:start w:val="1"/>
+      <w:numFmt w:val="bullet"/>
+      <w:lvlText w:val=""/>
+      <w:lvlJc w:val="left"/>
+      <w:pPr>
+        <w:tabs>
+          <w:tab w:val="num" w:pos="5760"/>
+        </w:tabs>
+        <w:ind w:left="5760" w:hanging="360"/>
+      </w:pPr>
+      <w:rPr>
+        <w:rFonts w:ascii="Wingdings" w:hAnsi="Wingdings" w:hint="default"/>
+        <w:sz w:val="20"/>
+      </w:rPr>
+    </w:lvl>
+    <w:lvl w:ilvl="8" w:tentative="1">
+      <w:start w:val="1"/>
+      <w:numFmt w:val="bullet"/>
+      <w:lvlText w:val=""/>
+      <w:lvlJc w:val="left"/>
+      <w:pPr>
+        <w:tabs>
+          <w:tab w:val="num" w:pos="6480"/>
+        </w:tabs>
+        <w:ind w:left="6480" w:hanging="360"/>
+      </w:pPr>
+      <w:rPr>
+        <w:rFonts w:ascii="Wingdings" w:hAnsi="Wingdings" w:hint="default"/>
+        <w:sz w:val="20"/>
+      </w:rPr>
+    </w:lvl>
+  </w:abstractNum>
+  <w:abstractNum w:abstractNumId="29" w15:restartNumberingAfterBreak="0">
+    <w:nsid w:val="6F671E86"/>
+    <w:multiLevelType w:val="multilevel"/>
+    <w:tmpl w:val="6932429A"/>
+    <w:lvl w:ilvl="0">
+      <w:start w:val="1"/>
+      <w:numFmt w:val="bullet"/>
+      <w:lvlText w:val=""/>
+      <w:lvlJc w:val="left"/>
+      <w:pPr>
+        <w:tabs>
+          <w:tab w:val="num" w:pos="720"/>
+        </w:tabs>
+        <w:ind w:left="720" w:hanging="360"/>
+      </w:pPr>
+      <w:rPr>
+        <w:rFonts w:ascii="Symbol" w:hAnsi="Symbol" w:hint="default"/>
+        <w:sz w:val="20"/>
+      </w:rPr>
+    </w:lvl>
+    <w:lvl w:ilvl="1" w:tentative="1">
+      <w:start w:val="1"/>
+      <w:numFmt w:val="bullet"/>
+      <w:lvlText w:val="o"/>
+      <w:lvlJc w:val="left"/>
+      <w:pPr>
+        <w:tabs>
+          <w:tab w:val="num" w:pos="1440"/>
+        </w:tabs>
+        <w:ind w:left="1440" w:hanging="360"/>
+      </w:pPr>
+      <w:rPr>
+        <w:rFonts w:ascii="Courier New" w:hAnsi="Courier New" w:hint="default"/>
+        <w:sz w:val="20"/>
+      </w:rPr>
+    </w:lvl>
+    <w:lvl w:ilvl="2" w:tentative="1">
+      <w:start w:val="1"/>
+      <w:numFmt w:val="bullet"/>
+      <w:lvlText w:val=""/>
+      <w:lvlJc w:val="left"/>
+      <w:pPr>
+        <w:tabs>
+          <w:tab w:val="num" w:pos="2160"/>
+        </w:tabs>
+        <w:ind w:left="2160" w:hanging="360"/>
+      </w:pPr>
+      <w:rPr>
+        <w:rFonts w:ascii="Wingdings" w:hAnsi="Wingdings" w:hint="default"/>
+        <w:sz w:val="20"/>
+      </w:rPr>
+    </w:lvl>
+    <w:lvl w:ilvl="3" w:tentative="1">
+      <w:start w:val="1"/>
+      <w:numFmt w:val="bullet"/>
+      <w:lvlText w:val=""/>
+      <w:lvlJc w:val="left"/>
+      <w:pPr>
+        <w:tabs>
+          <w:tab w:val="num" w:pos="2880"/>
+        </w:tabs>
+        <w:ind w:left="2880" w:hanging="360"/>
+      </w:pPr>
+      <w:rPr>
+        <w:rFonts w:ascii="Wingdings" w:hAnsi="Wingdings" w:hint="default"/>
+        <w:sz w:val="20"/>
+      </w:rPr>
+    </w:lvl>
+    <w:lvl w:ilvl="4" w:tentative="1">
+      <w:start w:val="1"/>
+      <w:numFmt w:val="bullet"/>
+      <w:lvlText w:val=""/>
+      <w:lvlJc w:val="left"/>
+      <w:pPr>
+        <w:tabs>
+          <w:tab w:val="num" w:pos="3600"/>
+        </w:tabs>
+        <w:ind w:left="3600" w:hanging="360"/>
+      </w:pPr>
+      <w:rPr>
+        <w:rFonts w:ascii="Wingdings" w:hAnsi="Wingdings" w:hint="default"/>
+        <w:sz w:val="20"/>
+      </w:rPr>
+    </w:lvl>
+    <w:lvl w:ilvl="5" w:tentative="1">
+      <w:start w:val="1"/>
+      <w:numFmt w:val="bullet"/>
+      <w:lvlText w:val=""/>
+      <w:lvlJc w:val="left"/>
+      <w:pPr>
+        <w:tabs>
+          <w:tab w:val="num" w:pos="4320"/>
+        </w:tabs>
+        <w:ind w:left="4320" w:hanging="360"/>
+      </w:pPr>
+      <w:rPr>
+        <w:rFonts w:ascii="Wingdings" w:hAnsi="Wingdings" w:hint="default"/>
+        <w:sz w:val="20"/>
+      </w:rPr>
+    </w:lvl>
+    <w:lvl w:ilvl="6" w:tentative="1">
+      <w:start w:val="1"/>
+      <w:numFmt w:val="bullet"/>
+      <w:lvlText w:val=""/>
+      <w:lvlJc w:val="left"/>
+      <w:pPr>
+        <w:tabs>
+          <w:tab w:val="num" w:pos="5040"/>
+        </w:tabs>
+        <w:ind w:left="5040" w:hanging="360"/>
+      </w:pPr>
+      <w:rPr>
+        <w:rFonts w:ascii="Wingdings" w:hAnsi="Wingdings" w:hint="default"/>
+        <w:sz w:val="20"/>
+      </w:rPr>
+    </w:lvl>
+    <w:lvl w:ilvl="7" w:tentative="1">
+      <w:start w:val="1"/>
+      <w:numFmt w:val="bullet"/>
+      <w:lvlText w:val=""/>
+      <w:lvlJc w:val="left"/>
+      <w:pPr>
+        <w:tabs>
+          <w:tab w:val="num" w:pos="5760"/>
+        </w:tabs>
+        <w:ind w:left="5760" w:hanging="360"/>
+      </w:pPr>
+      <w:rPr>
+        <w:rFonts w:ascii="Wingdings" w:hAnsi="Wingdings" w:hint="default"/>
+        <w:sz w:val="20"/>
+      </w:rPr>
+    </w:lvl>
+    <w:lvl w:ilvl="8" w:tentative="1">
+      <w:start w:val="1"/>
+      <w:numFmt w:val="bullet"/>
+      <w:lvlText w:val=""/>
+      <w:lvlJc w:val="left"/>
+      <w:pPr>
+        <w:tabs>
+          <w:tab w:val="num" w:pos="6480"/>
+        </w:tabs>
+        <w:ind w:left="6480" w:hanging="360"/>
+      </w:pPr>
+      <w:rPr>
+        <w:rFonts w:ascii="Wingdings" w:hAnsi="Wingdings" w:hint="default"/>
+        <w:sz w:val="20"/>
+      </w:rPr>
+    </w:lvl>
+  </w:abstractNum>
+  <w:abstractNum w:abstractNumId="30" w15:restartNumberingAfterBreak="0">
     <w:nsid w:val="74134192"/>
     <w:multiLevelType w:val="hybridMultilevel"/>
     <w:tmpl w:val="89B21C08"/>
@@ -2680,7 +6234,7 @@
       </w:rPr>
     </w:lvl>
   </w:abstractNum>
-  <w:abstractNum w:abstractNumId="19" w15:restartNumberingAfterBreak="0">
+  <w:abstractNum w:abstractNumId="31" w15:restartNumberingAfterBreak="0">
     <w:nsid w:val="741C233A"/>
     <w:multiLevelType w:val="hybridMultilevel"/>
     <w:tmpl w:val="60D2BD24"/>
@@ -2793,7 +6347,156 @@
       </w:rPr>
     </w:lvl>
   </w:abstractNum>
-  <w:abstractNum w:abstractNumId="20" w15:restartNumberingAfterBreak="0">
+  <w:abstractNum w:abstractNumId="32" w15:restartNumberingAfterBreak="0">
+    <w:nsid w:val="78831B25"/>
+    <w:multiLevelType w:val="multilevel"/>
+    <w:tmpl w:val="450E8E06"/>
+    <w:lvl w:ilvl="0">
+      <w:start w:val="1"/>
+      <w:numFmt w:val="bullet"/>
+      <w:lvlText w:val=""/>
+      <w:lvlJc w:val="left"/>
+      <w:pPr>
+        <w:tabs>
+          <w:tab w:val="num" w:pos="720"/>
+        </w:tabs>
+        <w:ind w:left="720" w:hanging="360"/>
+      </w:pPr>
+      <w:rPr>
+        <w:rFonts w:ascii="Symbol" w:hAnsi="Symbol" w:hint="default"/>
+        <w:sz w:val="20"/>
+      </w:rPr>
+    </w:lvl>
+    <w:lvl w:ilvl="1" w:tentative="1">
+      <w:start w:val="1"/>
+      <w:numFmt w:val="bullet"/>
+      <w:lvlText w:val="o"/>
+      <w:lvlJc w:val="left"/>
+      <w:pPr>
+        <w:tabs>
+          <w:tab w:val="num" w:pos="1440"/>
+        </w:tabs>
+        <w:ind w:left="1440" w:hanging="360"/>
+      </w:pPr>
+      <w:rPr>
+        <w:rFonts w:ascii="Courier New" w:hAnsi="Courier New" w:hint="default"/>
+        <w:sz w:val="20"/>
+      </w:rPr>
+    </w:lvl>
+    <w:lvl w:ilvl="2" w:tentative="1">
+      <w:start w:val="1"/>
+      <w:numFmt w:val="bullet"/>
+      <w:lvlText w:val=""/>
+      <w:lvlJc w:val="left"/>
+      <w:pPr>
+        <w:tabs>
+          <w:tab w:val="num" w:pos="2160"/>
+        </w:tabs>
+        <w:ind w:left="2160" w:hanging="360"/>
+      </w:pPr>
+      <w:rPr>
+        <w:rFonts w:ascii="Wingdings" w:hAnsi="Wingdings" w:hint="default"/>
+        <w:sz w:val="20"/>
+      </w:rPr>
+    </w:lvl>
+    <w:lvl w:ilvl="3" w:tentative="1">
+      <w:start w:val="1"/>
+      <w:numFmt w:val="bullet"/>
+      <w:lvlText w:val=""/>
+      <w:lvlJc w:val="left"/>
+      <w:pPr>
+        <w:tabs>
+          <w:tab w:val="num" w:pos="2880"/>
+        </w:tabs>
+        <w:ind w:left="2880" w:hanging="360"/>
+      </w:pPr>
+      <w:rPr>
+        <w:rFonts w:ascii="Wingdings" w:hAnsi="Wingdings" w:hint="default"/>
+        <w:sz w:val="20"/>
+      </w:rPr>
+    </w:lvl>
+    <w:lvl w:ilvl="4" w:tentative="1">
+      <w:start w:val="1"/>
+      <w:numFmt w:val="bullet"/>
+      <w:lvlText w:val=""/>
+      <w:lvlJc w:val="left"/>
+      <w:pPr>
+        <w:tabs>
+          <w:tab w:val="num" w:pos="3600"/>
+        </w:tabs>
+        <w:ind w:left="3600" w:hanging="360"/>
+      </w:pPr>
+      <w:rPr>
+        <w:rFonts w:ascii="Wingdings" w:hAnsi="Wingdings" w:hint="default"/>
+        <w:sz w:val="20"/>
+      </w:rPr>
+    </w:lvl>
+    <w:lvl w:ilvl="5" w:tentative="1">
+      <w:start w:val="1"/>
+      <w:numFmt w:val="bullet"/>
+      <w:lvlText w:val=""/>
+      <w:lvlJc w:val="left"/>
+      <w:pPr>
+        <w:tabs>
+          <w:tab w:val="num" w:pos="4320"/>
+        </w:tabs>
+        <w:ind w:left="4320" w:hanging="360"/>
+      </w:pPr>
+      <w:rPr>
+        <w:rFonts w:ascii="Wingdings" w:hAnsi="Wingdings" w:hint="default"/>
+        <w:sz w:val="20"/>
+      </w:rPr>
+    </w:lvl>
+    <w:lvl w:ilvl="6" w:tentative="1">
+      <w:start w:val="1"/>
+      <w:numFmt w:val="bullet"/>
+      <w:lvlText w:val=""/>
+      <w:lvlJc w:val="left"/>
+      <w:pPr>
+        <w:tabs>
+          <w:tab w:val="num" w:pos="5040"/>
+        </w:tabs>
+        <w:ind w:left="5040" w:hanging="360"/>
+      </w:pPr>
+      <w:rPr>
+        <w:rFonts w:ascii="Wingdings" w:hAnsi="Wingdings" w:hint="default"/>
+        <w:sz w:val="20"/>
+      </w:rPr>
+    </w:lvl>
+    <w:lvl w:ilvl="7" w:tentative="1">
+      <w:start w:val="1"/>
+      <w:numFmt w:val="bullet"/>
+      <w:lvlText w:val=""/>
+      <w:lvlJc w:val="left"/>
+      <w:pPr>
+        <w:tabs>
+          <w:tab w:val="num" w:pos="5760"/>
+        </w:tabs>
+        <w:ind w:left="5760" w:hanging="360"/>
+      </w:pPr>
+      <w:rPr>
+        <w:rFonts w:ascii="Wingdings" w:hAnsi="Wingdings" w:hint="default"/>
+        <w:sz w:val="20"/>
+      </w:rPr>
+    </w:lvl>
+    <w:lvl w:ilvl="8" w:tentative="1">
+      <w:start w:val="1"/>
+      <w:numFmt w:val="bullet"/>
+      <w:lvlText w:val=""/>
+      <w:lvlJc w:val="left"/>
+      <w:pPr>
+        <w:tabs>
+          <w:tab w:val="num" w:pos="6480"/>
+        </w:tabs>
+        <w:ind w:left="6480" w:hanging="360"/>
+      </w:pPr>
+      <w:rPr>
+        <w:rFonts w:ascii="Wingdings" w:hAnsi="Wingdings" w:hint="default"/>
+        <w:sz w:val="20"/>
+      </w:rPr>
+    </w:lvl>
+  </w:abstractNum>
+  <w:abstractNum w:abstractNumId="33" w15:restartNumberingAfterBreak="0">
     <w:nsid w:val="7EF30DED"/>
     <w:multiLevelType w:val="hybridMultilevel"/>
     <w:tmpl w:val="DD68A320"/>
@@ -2907,31 +6610,31 @@
     </w:lvl>
   </w:abstractNum>
   <w:num w:numId="1" w16cid:durableId="890581923">
-    <w:abstractNumId w:val="15"/>
+    <w:abstractNumId w:val="22"/>
   </w:num>
   <w:num w:numId="2" w16cid:durableId="2087876959">
+    <w:abstractNumId w:val="12"/>
+  </w:num>
+  <w:num w:numId="3" w16cid:durableId="1337463316">
+    <w:abstractNumId w:val="31"/>
+  </w:num>
+  <w:num w:numId="4" w16cid:durableId="203489483">
+    <w:abstractNumId w:val="14"/>
+  </w:num>
+  <w:num w:numId="5" w16cid:durableId="183173771">
     <w:abstractNumId w:val="11"/>
   </w:num>
-  <w:num w:numId="3" w16cid:durableId="1337463316">
-    <w:abstractNumId w:val="19"/>
-  </w:num>
-  <w:num w:numId="4" w16cid:durableId="203489483">
-    <w:abstractNumId w:val="12"/>
-  </w:num>
-  <w:num w:numId="5" w16cid:durableId="183173771">
-    <w:abstractNumId w:val="10"/>
-  </w:num>
   <w:num w:numId="6" w16cid:durableId="1496262083">
-    <w:abstractNumId w:val="13"/>
+    <w:abstractNumId w:val="17"/>
   </w:num>
   <w:num w:numId="7" w16cid:durableId="406221445">
-    <w:abstractNumId w:val="16"/>
+    <w:abstractNumId w:val="25"/>
   </w:num>
   <w:num w:numId="8" w16cid:durableId="1518958521">
-    <w:abstractNumId w:val="18"/>
+    <w:abstractNumId w:val="30"/>
   </w:num>
   <w:num w:numId="9" w16cid:durableId="1311403567">
-    <w:abstractNumId w:val="20"/>
+    <w:abstractNumId w:val="33"/>
   </w:num>
   <w:num w:numId="10" w16cid:durableId="65030402">
     <w:abstractNumId w:val="0"/>
@@ -2964,10 +6667,49 @@
     <w:abstractNumId w:val="9"/>
   </w:num>
   <w:num w:numId="20" w16cid:durableId="299069739">
-    <w:abstractNumId w:val="17"/>
+    <w:abstractNumId w:val="26"/>
   </w:num>
   <w:num w:numId="21" w16cid:durableId="176240445">
-    <w:abstractNumId w:val="14"/>
+    <w:abstractNumId w:val="19"/>
+  </w:num>
+  <w:num w:numId="22" w16cid:durableId="355421878">
+    <w:abstractNumId w:val="13"/>
+  </w:num>
+  <w:num w:numId="23" w16cid:durableId="1869836191">
+    <w:abstractNumId w:val="32"/>
+  </w:num>
+  <w:num w:numId="24" w16cid:durableId="846406528">
+    <w:abstractNumId w:val="29"/>
+  </w:num>
+  <w:num w:numId="25" w16cid:durableId="304359549">
+    <w:abstractNumId w:val="18"/>
+  </w:num>
+  <w:num w:numId="26" w16cid:durableId="38864188">
+    <w:abstractNumId w:val="21"/>
+  </w:num>
+  <w:num w:numId="27" w16cid:durableId="783768159">
+    <w:abstractNumId w:val="15"/>
+  </w:num>
+  <w:num w:numId="28" w16cid:durableId="40833369">
+    <w:abstractNumId w:val="23"/>
+  </w:num>
+  <w:num w:numId="29" w16cid:durableId="424036459">
+    <w:abstractNumId w:val="27"/>
+  </w:num>
+  <w:num w:numId="30" w16cid:durableId="1373965671">
+    <w:abstractNumId w:val="16"/>
+  </w:num>
+  <w:num w:numId="31" w16cid:durableId="607935688">
+    <w:abstractNumId w:val="20"/>
+  </w:num>
+  <w:num w:numId="32" w16cid:durableId="1827473032">
+    <w:abstractNumId w:val="10"/>
+  </w:num>
+  <w:num w:numId="33" w16cid:durableId="1873418479">
+    <w:abstractNumId w:val="24"/>
+  </w:num>
+  <w:num w:numId="34" w16cid:durableId="1389911385">
+    <w:abstractNumId w:val="28"/>
   </w:num>
 </w:numbering>
 </file>
@@ -3397,9 +7139,9 @@
     <w:link w:val="Heading2Char"/>
     <w:uiPriority w:val="1"/>
     <w:qFormat/>
-    <w:rsid w:val="002553BD"/>
+    <w:rsid w:val="001F1427"/>
     <w:pPr>
-      <w:spacing w:before="480" w:after="360"/>
+      <w:spacing w:before="120" w:after="120"/>
       <w:ind w:left="360" w:right="360"/>
       <w:outlineLvl w:val="1"/>
     </w:pPr>
@@ -3443,7 +7185,6 @@
   <w:style w:type="character" w:default="1" w:styleId="DefaultParagraphFont">
     <w:name w:val="Default Paragraph Font"/>
     <w:uiPriority w:val="1"/>
-    <w:semiHidden/>
     <w:unhideWhenUsed/>
   </w:style>
   <w:style w:type="table" w:default="1" w:styleId="TableNormal">
@@ -3541,7 +7282,7 @@
     <w:basedOn w:val="DefaultParagraphFont"/>
     <w:link w:val="Heading2"/>
     <w:uiPriority w:val="1"/>
-    <w:rsid w:val="002553BD"/>
+    <w:rsid w:val="001F1427"/>
     <w:rPr>
       <w:caps/>
       <w:color w:val="000000" w:themeColor="text1"/>
@@ -3959,7 +7700,6 @@
       <w:numPr>
         <w:numId w:val="20"/>
       </w:numPr>
-      <w:spacing w:before="120"/>
     </w:pPr>
     <w:rPr>
       <w:b/>
@@ -5190,30 +8930,15 @@
 </file>
 
 <file path=customXml/item1.xml><?xml version="1.0" encoding="utf-8"?>
-<b:Sources xmlns:b="http://schemas.openxmlformats.org/officeDocument/2006/bibliography" xmlns="http://schemas.openxmlformats.org/officeDocument/2006/bibliography" SelectedStyle="\APASixthEditionOfficeOnline.xsl" StyleName="APA" Version="6"/>
+<?mso-contentType ?>
+<FormTemplates xmlns="http://schemas.microsoft.com/sharepoint/v3/contenttype/forms">
+  <Display>DocumentLibraryForm</Display>
+  <Edit>DocumentLibraryForm</Edit>
+  <New>DocumentLibraryForm</New>
+</FormTemplates>
 </file>
 
 <file path=customXml/item2.xml><?xml version="1.0" encoding="utf-8"?>
-<p:properties xmlns:p="http://schemas.microsoft.com/office/2006/metadata/properties" xmlns:xsi="http://www.w3.org/2001/XMLSchema-instance" xmlns:pc="http://schemas.microsoft.com/office/infopath/2007/PartnerControls">
-  <documentManagement>
-    <Status xmlns="71af3243-3dd4-4a8d-8c0d-dd76da1f02a5">Not started</Status>
-    <MediaServiceKeyPoints xmlns="71af3243-3dd4-4a8d-8c0d-dd76da1f02a5" xsi:nil="true"/>
-    <_ip_UnifiedCompliancePolicyUIAction xmlns="http://schemas.microsoft.com/sharepoint/v3" xsi:nil="true"/>
-    <Image xmlns="71af3243-3dd4-4a8d-8c0d-dd76da1f02a5">
-      <Url xsi:nil="true"/>
-      <Description xsi:nil="true"/>
-    </Image>
-    <Background xmlns="71af3243-3dd4-4a8d-8c0d-dd76da1f02a5">false</Background>
-    <_ip_UnifiedCompliancePolicyProperties xmlns="http://schemas.microsoft.com/sharepoint/v3" xsi:nil="true"/>
-    <ImageTagsTaxHTField xmlns="71af3243-3dd4-4a8d-8c0d-dd76da1f02a5">
-      <Terms xmlns="http://schemas.microsoft.com/office/infopath/2007/PartnerControls"/>
-    </ImageTagsTaxHTField>
-    <TaxCatchAll xmlns="230e9df3-be65-4c73-a93b-d1236ebd677e" xsi:nil="true"/>
-  </documentManagement>
-</p:properties>
-</file>
-
-<file path=customXml/item3.xml><?xml version="1.0" encoding="utf-8"?>
 <ct:contentTypeSchema xmlns:ct="http://schemas.microsoft.com/office/2006/metadata/contentType" xmlns:ma="http://schemas.microsoft.com/office/2006/metadata/properties/metaAttributes" ct:_="" ma:_="" ma:contentTypeName="Document" ma:contentTypeID="0x01010079F111ED35F8CC479449609E8A0923A6" ma:contentTypeVersion="30" ma:contentTypeDescription="Create a new document." ma:contentTypeScope="" ma:versionID="cec0622158e8f13124e9e8fd4de31bd1">
   <xsd:schema xmlns:xsd="http://www.w3.org/2001/XMLSchema" xmlns:xs="http://www.w3.org/2001/XMLSchema" xmlns:p="http://schemas.microsoft.com/office/2006/metadata/properties" xmlns:ns1="http://schemas.microsoft.com/sharepoint/v3" xmlns:ns2="71af3243-3dd4-4a8d-8c0d-dd76da1f02a5" xmlns:ns3="16c05727-aa75-4e4a-9b5f-8a80a1165891" xmlns:ns4="230e9df3-be65-4c73-a93b-d1236ebd677e" targetNamespace="http://schemas.microsoft.com/office/2006/metadata/properties" ma:root="true" ma:fieldsID="3b52f30ab005d15df08657af532e6e38" ns1:_="" ns2:_="" ns3:_="" ns4:_="">
     <xsd:import namespace="http://schemas.microsoft.com/sharepoint/v3"/>
@@ -5531,36 +9256,39 @@
 </ct:contentTypeSchema>
 </file>
 
+<file path=customXml/item3.xml><?xml version="1.0" encoding="utf-8"?>
+<p:properties xmlns:p="http://schemas.microsoft.com/office/2006/metadata/properties" xmlns:xsi="http://www.w3.org/2001/XMLSchema-instance" xmlns:pc="http://schemas.microsoft.com/office/infopath/2007/PartnerControls">
+  <documentManagement>
+    <Status xmlns="71af3243-3dd4-4a8d-8c0d-dd76da1f02a5">Not started</Status>
+    <MediaServiceKeyPoints xmlns="71af3243-3dd4-4a8d-8c0d-dd76da1f02a5" xsi:nil="true"/>
+    <_ip_UnifiedCompliancePolicyUIAction xmlns="http://schemas.microsoft.com/sharepoint/v3" xsi:nil="true"/>
+    <Image xmlns="71af3243-3dd4-4a8d-8c0d-dd76da1f02a5">
+      <Url xsi:nil="true"/>
+      <Description xsi:nil="true"/>
+    </Image>
+    <Background xmlns="71af3243-3dd4-4a8d-8c0d-dd76da1f02a5">false</Background>
+    <_ip_UnifiedCompliancePolicyProperties xmlns="http://schemas.microsoft.com/sharepoint/v3" xsi:nil="true"/>
+    <ImageTagsTaxHTField xmlns="71af3243-3dd4-4a8d-8c0d-dd76da1f02a5">
+      <Terms xmlns="http://schemas.microsoft.com/office/infopath/2007/PartnerControls"/>
+    </ImageTagsTaxHTField>
+    <TaxCatchAll xmlns="230e9df3-be65-4c73-a93b-d1236ebd677e" xsi:nil="true"/>
+  </documentManagement>
+</p:properties>
+</file>
+
 <file path=customXml/item4.xml><?xml version="1.0" encoding="utf-8"?>
-<?mso-contentType ?>
-<FormTemplates xmlns="http://schemas.microsoft.com/sharepoint/v3/contenttype/forms">
-  <Display>DocumentLibraryForm</Display>
-  <Edit>DocumentLibraryForm</Edit>
-  <New>DocumentLibraryForm</New>
-</FormTemplates>
+<b:Sources xmlns:b="http://schemas.openxmlformats.org/officeDocument/2006/bibliography" xmlns="http://schemas.openxmlformats.org/officeDocument/2006/bibliography" SelectedStyle="\APASixthEditionOfficeOnline.xsl" StyleName="APA" Version="6"/>
 </file>
 
 <file path=customXml/itemProps1.xml><?xml version="1.0" encoding="utf-8"?>
-<ds:datastoreItem xmlns:ds="http://schemas.openxmlformats.org/officeDocument/2006/customXml" ds:itemID="{8350094C-0D3E-4E0A-A2D0-7BE047D09FEF}">
+<ds:datastoreItem xmlns:ds="http://schemas.openxmlformats.org/officeDocument/2006/customXml" ds:itemID="{FC408F27-B5ED-4462-B2CB-58DE6D45B7BD}">
   <ds:schemaRefs>
-    <ds:schemaRef ds:uri="http://schemas.openxmlformats.org/officeDocument/2006/bibliography"/>
+    <ds:schemaRef ds:uri="http://schemas.microsoft.com/sharepoint/v3/contenttype/forms"/>
   </ds:schemaRefs>
 </ds:datastoreItem>
 </file>
 
 <file path=customXml/itemProps2.xml><?xml version="1.0" encoding="utf-8"?>
-<ds:datastoreItem xmlns:ds="http://schemas.openxmlformats.org/officeDocument/2006/customXml" ds:itemID="{8798095E-4456-4E45-8445-539B9EDACF3C}">
-  <ds:schemaRefs>
-    <ds:schemaRef ds:uri="http://schemas.microsoft.com/office/2006/metadata/properties"/>
-    <ds:schemaRef ds:uri="http://schemas.microsoft.com/office/infopath/2007/PartnerControls"/>
-    <ds:schemaRef ds:uri="71af3243-3dd4-4a8d-8c0d-dd76da1f02a5"/>
-    <ds:schemaRef ds:uri="http://schemas.microsoft.com/sharepoint/v3"/>
-    <ds:schemaRef ds:uri="230e9df3-be65-4c73-a93b-d1236ebd677e"/>
-  </ds:schemaRefs>
-</ds:datastoreItem>
-</file>
-
-<file path=customXml/itemProps3.xml><?xml version="1.0" encoding="utf-8"?>
 <ds:datastoreItem xmlns:ds="http://schemas.openxmlformats.org/officeDocument/2006/customXml" ds:itemID="{18EB9497-C3FA-44B4-AD7B-A28C824BF395}">
   <ds:schemaRefs>
     <ds:schemaRef ds:uri="http://schemas.microsoft.com/office/2006/metadata/contentType"/>
@@ -5581,10 +9309,22 @@
 </ds:datastoreItem>
 </file>
 
+<file path=customXml/itemProps3.xml><?xml version="1.0" encoding="utf-8"?>
+<ds:datastoreItem xmlns:ds="http://schemas.openxmlformats.org/officeDocument/2006/customXml" ds:itemID="{8798095E-4456-4E45-8445-539B9EDACF3C}">
+  <ds:schemaRefs>
+    <ds:schemaRef ds:uri="http://schemas.microsoft.com/office/2006/metadata/properties"/>
+    <ds:schemaRef ds:uri="http://schemas.microsoft.com/office/infopath/2007/PartnerControls"/>
+    <ds:schemaRef ds:uri="71af3243-3dd4-4a8d-8c0d-dd76da1f02a5"/>
+    <ds:schemaRef ds:uri="http://schemas.microsoft.com/sharepoint/v3"/>
+    <ds:schemaRef ds:uri="230e9df3-be65-4c73-a93b-d1236ebd677e"/>
+  </ds:schemaRefs>
+</ds:datastoreItem>
+</file>
+
 <file path=customXml/itemProps4.xml><?xml version="1.0" encoding="utf-8"?>
-<ds:datastoreItem xmlns:ds="http://schemas.openxmlformats.org/officeDocument/2006/customXml" ds:itemID="{FC408F27-B5ED-4462-B2CB-58DE6D45B7BD}">
+<ds:datastoreItem xmlns:ds="http://schemas.openxmlformats.org/officeDocument/2006/customXml" ds:itemID="{8350094C-0D3E-4E0A-A2D0-7BE047D09FEF}">
   <ds:schemaRefs>
-    <ds:schemaRef ds:uri="http://schemas.microsoft.com/sharepoint/v3/contenttype/forms"/>
+    <ds:schemaRef ds:uri="http://schemas.openxmlformats.org/officeDocument/2006/bibliography"/>
   </ds:schemaRefs>
 </ds:datastoreItem>
 </file>

</xml_diff>